<commit_message>
Implemented second SME feedback
</commit_message>
<xml_diff>
--- a/docassemble/PetitionForRuleToShowCauseFamily/data/templates/instructions_petition_rule_cause_family.docx
+++ b/docassemble/PetitionForRuleToShowCauseFamily/data/templates/instructions_petition_rule_cause_family.docx
@@ -188,7 +188,31 @@
                 <w:sz w:val="24"/>
                 <w:szCs w:val="24"/>
               </w:rPr>
-              <w:t>Attach a copy of the order</w:t>
+              <w:t xml:space="preserve">Attach a copy of the </w:t>
+            </w:r>
+            <w:r>
+              <w:rPr>
+                <w:rFonts w:cs="Arial"/>
+                <w:sz w:val="24"/>
+                <w:szCs w:val="24"/>
+              </w:rPr>
+              <w:t xml:space="preserve">court </w:t>
+            </w:r>
+            <w:r>
+              <w:rPr>
+                <w:rFonts w:cs="Arial"/>
+                <w:sz w:val="24"/>
+                <w:szCs w:val="24"/>
+              </w:rPr>
+              <w:t>order</w:t>
+            </w:r>
+            <w:r>
+              <w:rPr>
+                <w:rFonts w:cs="Arial"/>
+                <w:sz w:val="24"/>
+                <w:szCs w:val="24"/>
+              </w:rPr>
+              <w:t xml:space="preserve"> you want the court to enforce</w:t>
             </w:r>
             <w:r>
               <w:rPr>
@@ -1191,7 +1215,7 @@
                 <w:sz w:val="24"/>
                 <w:szCs w:val="24"/>
               </w:rPr>
-              <w:t>will</w:t>
+              <w:t>should</w:t>
             </w:r>
             <w:r>
               <w:rPr>
@@ -1227,6 +1251,14 @@
                 <w:szCs w:val="24"/>
               </w:rPr>
               <w:t xml:space="preserve"> your records.</w:t>
+            </w:r>
+            <w:r>
+              <w:rPr>
+                <w:rFonts w:ascii="Arial" w:hAnsi="Arial" w:cs="Arial"/>
+                <w:sz w:val="24"/>
+                <w:szCs w:val="24"/>
+              </w:rPr>
+              <w:t xml:space="preserve"> If they do not, you can ask for a copy of the file stamped forms before leaving the court building.</w:t>
             </w:r>
           </w:p>
           <w:p>
@@ -1644,6 +1676,39 @@
               </w:rPr>
               <w:t>court date (or hearing date) and time. If it does not, contact the clerk.</w:t>
             </w:r>
+            <w:r>
+              <w:rPr>
+                <w:rFonts w:ascii="Arial" w:hAnsi="Arial" w:cs="Arial"/>
+                <w:sz w:val="24"/>
+              </w:rPr>
+              <w:t xml:space="preserve"> To find the clerk for your </w:t>
+            </w:r>
+            <w:proofErr w:type="gramStart"/>
+            <w:r>
+              <w:rPr>
+                <w:rFonts w:ascii="Arial" w:hAnsi="Arial" w:cs="Arial"/>
+                <w:sz w:val="24"/>
+              </w:rPr>
+              <w:t>county,  go</w:t>
+            </w:r>
+            <w:proofErr w:type="gramEnd"/>
+            <w:r>
+              <w:rPr>
+                <w:rFonts w:ascii="Arial" w:hAnsi="Arial" w:cs="Arial"/>
+                <w:sz w:val="24"/>
+              </w:rPr>
+              <w:t xml:space="preserve"> to </w:t>
+            </w:r>
+            <w:hyperlink r:id="rId13" w:history="1">
+              <w:r>
+                <w:rPr>
+                  <w:rStyle w:val="Hyperlink"/>
+                  <w:rFonts w:ascii="Arial" w:hAnsi="Arial" w:cs="Arial"/>
+                  <w:sz w:val="24"/>
+                </w:rPr>
+                <w:t>https://www.illinoiscourts.gov/courts/circuit-court/circuit-court-clerks/</w:t>
+              </w:r>
+            </w:hyperlink>
           </w:p>
           <w:p>
             <w:pPr>
@@ -2365,17 +2430,8 @@
                 <w:rFonts w:ascii="Arial" w:hAnsi="Arial" w:cs="Arial"/>
                 <w:sz w:val="24"/>
               </w:rPr>
-              <w:t>(marked as Exhibit A</w:t>
-            </w:r>
-            <w:proofErr w:type="gramStart"/>
-            <w:r>
-              <w:rPr>
-                <w:rFonts w:ascii="Arial" w:hAnsi="Arial" w:cs="Arial"/>
-                <w:sz w:val="24"/>
-              </w:rPr>
-              <w:t>);</w:t>
-            </w:r>
-            <w:proofErr w:type="gramEnd"/>
+              <w:t>(marked as Exhibit A);</w:t>
+            </w:r>
           </w:p>
           <w:p>
             <w:pPr>
@@ -2583,17 +2639,8 @@
                 <w:rFonts w:ascii="Arial" w:hAnsi="Arial" w:cs="Arial"/>
                 <w:sz w:val="24"/>
               </w:rPr>
-              <w:t>the court order (marked as Exhibit B, Exhibit C, etc.</w:t>
-            </w:r>
-            <w:proofErr w:type="gramStart"/>
-            <w:r>
-              <w:rPr>
-                <w:rFonts w:ascii="Arial" w:hAnsi="Arial" w:cs="Arial"/>
-                <w:sz w:val="24"/>
-              </w:rPr>
-              <w:t>);</w:t>
-            </w:r>
-            <w:proofErr w:type="gramEnd"/>
+              <w:t>the court order (marked as Exhibit B, Exhibit C, etc.);</w:t>
+            </w:r>
           </w:p>
           <w:p>
             <w:pPr>
@@ -2736,6 +2783,7 @@
           <w:p>
             <w:pPr>
               <w:pStyle w:val="NoSpacing"/>
+              <w:keepNext/>
               <w:spacing w:after="40" w:line="360" w:lineRule="auto"/>
               <w:rPr>
                 <w:rFonts w:cs="Arial"/>
@@ -2751,6 +2799,7 @@
                 <w:sz w:val="24"/>
                 <w:szCs w:val="24"/>
               </w:rPr>
+              <w:lastRenderedPageBreak/>
               <w:t xml:space="preserve">5. </w:t>
             </w:r>
             <w:r>
@@ -2760,7 +2809,7 @@
                 <w:sz w:val="24"/>
                 <w:szCs w:val="24"/>
               </w:rPr>
-              <w:t>Go to court for the hearing</w:t>
+              <w:t>Go to court</w:t>
             </w:r>
           </w:p>
           <w:p>
@@ -2783,12 +2832,16 @@
                 <w:sz w:val="24"/>
                 <w:szCs w:val="24"/>
               </w:rPr>
-              <w:t>Go to court on the day listed on your notice.</w:t>
+              <w:t>Go to court to present your petition to the judge. The judge may issue an Order on Rule to Show Cause based on your petition.</w:t>
             </w:r>
           </w:p>
           <w:p>
             <w:pPr>
               <w:pStyle w:val="NoSpacing"/>
+              <w:numPr>
+                <w:ilvl w:val="0"/>
+                <w:numId w:val="4"/>
+              </w:numPr>
               <w:spacing w:after="40" w:line="360" w:lineRule="auto"/>
               <w:rPr>
                 <w:rFonts w:cs="Arial"/>
@@ -2796,10 +2849,22 @@
                 <w:szCs w:val="24"/>
               </w:rPr>
             </w:pPr>
+            <w:r>
+              <w:rPr>
+                <w:rFonts w:cs="Arial"/>
+                <w:sz w:val="24"/>
+                <w:szCs w:val="24"/>
+              </w:rPr>
+              <w:t>The judge may grant the other party time to respond, and the court will then set a date for the hearing.</w:t>
+            </w:r>
           </w:p>
           <w:p>
             <w:pPr>
               <w:pStyle w:val="NoSpacing"/>
+              <w:numPr>
+                <w:ilvl w:val="0"/>
+                <w:numId w:val="4"/>
+              </w:numPr>
               <w:spacing w:after="40" w:line="360" w:lineRule="auto"/>
               <w:rPr>
                 <w:rFonts w:cs="Arial"/>
@@ -2807,17 +2872,14 @@
                 <w:szCs w:val="24"/>
               </w:rPr>
             </w:pPr>
-          </w:p>
-          <w:p>
-            <w:pPr>
-              <w:pStyle w:val="NoSpacing"/>
-              <w:spacing w:after="40" w:line="360" w:lineRule="auto"/>
-              <w:rPr>
-                <w:rFonts w:cs="Arial"/>
-                <w:sz w:val="24"/>
-                <w:szCs w:val="24"/>
-              </w:rPr>
-            </w:pPr>
+            <w:r>
+              <w:rPr>
+                <w:rFonts w:cs="Arial"/>
+                <w:sz w:val="24"/>
+                <w:szCs w:val="24"/>
+              </w:rPr>
+              <w:t>Go to court on the day listed on your notice.</w:t>
+            </w:r>
           </w:p>
           <w:p>
             <w:pPr>
@@ -3304,6 +3366,7 @@
                 <w:sz w:val="24"/>
                 <w:szCs w:val="24"/>
               </w:rPr>
+              <w:lastRenderedPageBreak/>
               <w:t>If the other side has a lawyer, and the lawyer prepares the order, make sure you read it before it is presented for the judge's signature. If you disagree with the order, try to work out the problem with the lawyer. If that does not work, tell the clerk you need to speak to the judge again.</w:t>
             </w:r>
           </w:p>
@@ -3337,12 +3400,12 @@
     </w:tbl>
     <w:p/>
     <w:sectPr>
-      <w:headerReference w:type="even" r:id="rId13"/>
-      <w:headerReference w:type="default" r:id="rId14"/>
-      <w:footerReference w:type="even" r:id="rId15"/>
-      <w:footerReference w:type="default" r:id="rId16"/>
-      <w:headerReference w:type="first" r:id="rId17"/>
-      <w:footerReference w:type="first" r:id="rId18"/>
+      <w:headerReference w:type="even" r:id="rId14"/>
+      <w:headerReference w:type="default" r:id="rId15"/>
+      <w:footerReference w:type="even" r:id="rId16"/>
+      <w:footerReference w:type="default" r:id="rId17"/>
+      <w:headerReference w:type="first" r:id="rId18"/>
+      <w:footerReference w:type="first" r:id="rId19"/>
       <w:pgSz w:w="12240" w:h="15840"/>
       <w:pgMar w:top="720" w:right="720" w:bottom="720" w:left="720" w:header="720" w:footer="720" w:gutter="0"/>
       <w:cols w:space="720"/>

</xml_diff>

<commit_message>
Implemented May 6 2026 feedback
</commit_message>
<xml_diff>
--- a/docassemble/PetitionForRuleToShowCauseFamily/data/templates/instructions_petition_rule_cause_family.docx
+++ b/docassemble/PetitionForRuleToShowCauseFamily/data/templates/instructions_petition_rule_cause_family.docx
@@ -13,7 +13,7 @@
       </w:tblGrid>
       <w:tr>
         <w:trPr>
-          <w:trHeight w:val="1080"/>
+          <w:trHeight w:val="720"/>
         </w:trPr>
         <w:tc>
           <w:tcPr>
@@ -21,7 +21,7 @@
             <w:tcBorders>
               <w:top w:val="nil"/>
               <w:left w:val="nil"/>
-              <w:bottom w:val="single" w:sz="4" w:space="0" w:color="auto"/>
+              <w:bottom w:val="nil"/>
               <w:right w:val="nil"/>
             </w:tcBorders>
           </w:tcPr>
@@ -39,13 +39,13 @@
                 <w:szCs w:val="32"/>
               </w:rPr>
               <w:drawing>
-                <wp:anchor distT="0" distB="0" distL="114300" distR="114300" simplePos="0" relativeHeight="251659264" behindDoc="0" locked="0" layoutInCell="1" allowOverlap="1" wp14:anchorId="2DE34B16" wp14:editId="2D4FB96C">
+                <wp:anchor distT="0" distB="0" distL="114300" distR="114300" simplePos="0" relativeHeight="251659264" behindDoc="0" locked="0" layoutInCell="1" allowOverlap="1" wp14:anchorId="2DE34B16" wp14:editId="183D0552">
                   <wp:simplePos x="0" y="0"/>
                   <wp:positionH relativeFrom="column">
-                    <wp:posOffset>5646783</wp:posOffset>
+                    <wp:posOffset>5646420</wp:posOffset>
                   </wp:positionH>
                   <wp:positionV relativeFrom="paragraph">
-                    <wp:posOffset>181</wp:posOffset>
+                    <wp:posOffset>0</wp:posOffset>
                   </wp:positionV>
                   <wp:extent cx="1143000" cy="640715"/>
                   <wp:effectExtent l="0" t="0" r="0" b="6985"/>
@@ -120,15 +120,18 @@
           <w:tcPr>
             <w:tcW w:w="10800" w:type="dxa"/>
             <w:tcBorders>
-              <w:top w:val="single" w:sz="4" w:space="0" w:color="auto"/>
+              <w:top w:val="nil"/>
               <w:left w:val="nil"/>
-              <w:bottom w:val="single" w:sz="4" w:space="0" w:color="auto"/>
+              <w:bottom w:val="nil"/>
               <w:right w:val="nil"/>
             </w:tcBorders>
           </w:tcPr>
           <w:p>
             <w:pPr>
               <w:pStyle w:val="NoSpacing"/>
+              <w:pBdr>
+                <w:bottom w:val="single" w:sz="6" w:space="1" w:color="auto"/>
+              </w:pBdr>
               <w:spacing w:after="40" w:line="360" w:lineRule="auto"/>
               <w:rPr>
                 <w:rFonts w:cs="Arial"/>
@@ -259,25 +262,7 @@
                 <w:sz w:val="24"/>
                 <w:szCs w:val="24"/>
               </w:rPr>
-              <w:t xml:space="preserve">Attach copies of any </w:t>
-            </w:r>
-            <w:proofErr w:type="gramStart"/>
-            <w:r>
-              <w:rPr>
-                <w:rFonts w:cs="Arial"/>
-                <w:sz w:val="24"/>
-                <w:szCs w:val="24"/>
-              </w:rPr>
-              <w:t>documents</w:t>
-            </w:r>
-            <w:proofErr w:type="gramEnd"/>
-            <w:r>
-              <w:rPr>
-                <w:rFonts w:cs="Arial"/>
-                <w:sz w:val="24"/>
-                <w:szCs w:val="24"/>
-              </w:rPr>
-              <w:t xml:space="preserve"> that will show the judge that the other person violated the court order. For example, a history of child support payments. If your child support payments are sent to you through the Illinois State Disbursement Unit (ILSDU), visit </w:t>
+              <w:t xml:space="preserve">Attach copies of any documents that will show the judge that the other person violated the court order. For example, a history of child support payments. If your child support payments are sent to you through the Illinois State Disbursement Unit (ILSDU), visit </w:t>
             </w:r>
             <w:hyperlink r:id="rId9">
               <w:r>
@@ -616,6 +601,13 @@
             </w:r>
             <w:r>
               <w:rPr>
+                <w:spacing w:val="-2"/>
+                <w:sz w:val="24"/>
+              </w:rPr>
+              <w:t xml:space="preserve">the </w:t>
+            </w:r>
+            <w:r>
+              <w:rPr>
                 <w:sz w:val="24"/>
               </w:rPr>
               <w:t>date</w:t>
@@ -639,6 +631,13 @@
                 <w:sz w:val="24"/>
               </w:rPr>
               <w:t xml:space="preserve"> </w:t>
+            </w:r>
+            <w:r>
+              <w:rPr>
+                <w:spacing w:val="-2"/>
+                <w:sz w:val="24"/>
+              </w:rPr>
+              <w:t xml:space="preserve">the </w:t>
             </w:r>
             <w:r>
               <w:rPr>
@@ -1232,25 +1231,7 @@
                 <w:sz w:val="24"/>
                 <w:szCs w:val="24"/>
               </w:rPr>
-              <w:t xml:space="preserve">give you a copy </w:t>
-            </w:r>
-            <w:proofErr w:type="gramStart"/>
-            <w:r>
-              <w:rPr>
-                <w:rFonts w:ascii="Arial" w:hAnsi="Arial" w:cs="Arial"/>
-                <w:sz w:val="24"/>
-                <w:szCs w:val="24"/>
-              </w:rPr>
-              <w:t>for</w:t>
-            </w:r>
-            <w:proofErr w:type="gramEnd"/>
-            <w:r>
-              <w:rPr>
-                <w:rFonts w:ascii="Arial" w:hAnsi="Arial" w:cs="Arial"/>
-                <w:sz w:val="24"/>
-                <w:szCs w:val="24"/>
-              </w:rPr>
-              <w:t xml:space="preserve"> your records.</w:t>
+              <w:t>give you a copy for your records.</w:t>
             </w:r>
             <w:r>
               <w:rPr>
@@ -1424,25 +1405,7 @@
                 <w:sz w:val="24"/>
                 <w:szCs w:val="24"/>
               </w:rPr>
-              <w:t xml:space="preserve">You will need to schedule a hearing with the clerk. How you will find out about the hearing date and time depends on how you </w:t>
-            </w:r>
-            <w:proofErr w:type="gramStart"/>
-            <w:r>
-              <w:rPr>
-                <w:rFonts w:cs="Arial"/>
-                <w:sz w:val="24"/>
-                <w:szCs w:val="24"/>
-              </w:rPr>
-              <w:t>filed</w:t>
-            </w:r>
-            <w:proofErr w:type="gramEnd"/>
-            <w:r>
-              <w:rPr>
-                <w:rFonts w:cs="Arial"/>
-                <w:sz w:val="24"/>
-                <w:szCs w:val="24"/>
-              </w:rPr>
-              <w:t xml:space="preserve"> your case</w:t>
+              <w:t>You will need to schedule a hearing with the clerk. How you will find out about the hearing date and time depends on how you filed your case</w:t>
             </w:r>
             <w:r>
               <w:rPr>
@@ -1681,23 +1644,7 @@
                 <w:rFonts w:ascii="Arial" w:hAnsi="Arial" w:cs="Arial"/>
                 <w:sz w:val="24"/>
               </w:rPr>
-              <w:t xml:space="preserve"> To find the clerk for your </w:t>
-            </w:r>
-            <w:proofErr w:type="gramStart"/>
-            <w:r>
-              <w:rPr>
-                <w:rFonts w:ascii="Arial" w:hAnsi="Arial" w:cs="Arial"/>
-                <w:sz w:val="24"/>
-              </w:rPr>
-              <w:t>county,  go</w:t>
-            </w:r>
-            <w:proofErr w:type="gramEnd"/>
-            <w:r>
-              <w:rPr>
-                <w:rFonts w:ascii="Arial" w:hAnsi="Arial" w:cs="Arial"/>
-                <w:sz w:val="24"/>
-              </w:rPr>
-              <w:t xml:space="preserve"> to </w:t>
+              <w:t xml:space="preserve"> To find the clerk for your county,  go to </w:t>
             </w:r>
             <w:hyperlink r:id="rId13" w:history="1">
               <w:r>
@@ -1911,7 +1858,6 @@
               </w:rPr>
               <w:t xml:space="preserve"> </w:t>
             </w:r>
-            <w:proofErr w:type="gramStart"/>
             <w:r>
               <w:rPr>
                 <w:rFonts w:ascii="Arial" w:hAnsi="Arial" w:cs="Arial"/>
@@ -1919,7 +1865,6 @@
               </w:rPr>
               <w:t>will</w:t>
             </w:r>
-            <w:proofErr w:type="gramEnd"/>
             <w:r>
               <w:rPr>
                 <w:rFonts w:ascii="Arial" w:hAnsi="Arial" w:cs="Arial"/>
@@ -1978,23 +1923,7 @@
                 <w:rFonts w:ascii="Arial" w:hAnsi="Arial" w:cs="Arial"/>
                 <w:sz w:val="24"/>
               </w:rPr>
-              <w:t xml:space="preserve">or they may </w:t>
-            </w:r>
-            <w:proofErr w:type="gramStart"/>
-            <w:r>
-              <w:rPr>
-                <w:rFonts w:ascii="Arial" w:hAnsi="Arial" w:cs="Arial"/>
-                <w:sz w:val="24"/>
-              </w:rPr>
-              <w:t>pick for you</w:t>
-            </w:r>
-            <w:proofErr w:type="gramEnd"/>
-            <w:r>
-              <w:rPr>
-                <w:rFonts w:ascii="Arial" w:hAnsi="Arial" w:cs="Arial"/>
-                <w:sz w:val="24"/>
-              </w:rPr>
-              <w:t>.</w:t>
+              <w:t>or they may pick for you.</w:t>
             </w:r>
           </w:p>
           <w:p>
@@ -2815,6 +2744,9 @@
           <w:p>
             <w:pPr>
               <w:pStyle w:val="NoSpacing"/>
+              <w:keepNext/>
+              <w:keepLines/>
+              <w:pageBreakBefore/>
               <w:numPr>
                 <w:ilvl w:val="0"/>
                 <w:numId w:val="4"/>
@@ -2832,7 +2764,7 @@
                 <w:sz w:val="24"/>
                 <w:szCs w:val="24"/>
               </w:rPr>
-              <w:t>Go to court to present your petition to the judge. The judge may issue an Order on Rule to Show Cause based on your petition.</w:t>
+              <w:t>You have the right to represent yourself in court. However, you are expected to follow the court's rules and procedures. Most people who work in the courthouse cannot give you legal advice; meaning they cannot help you decide what to do, evaluate your possibility of success, or present your argument to the judge.</w:t>
             </w:r>
           </w:p>
           <w:p>
@@ -2855,7 +2787,31 @@
                 <w:sz w:val="24"/>
                 <w:szCs w:val="24"/>
               </w:rPr>
-              <w:t>The judge may grant the other party time to respond, and the court will then set a date for the hearing.</w:t>
+              <w:t>Present</w:t>
+            </w:r>
+            <w:r>
+              <w:rPr>
+                <w:rFonts w:cs="Arial"/>
+                <w:sz w:val="24"/>
+                <w:szCs w:val="24"/>
+              </w:rPr>
+              <w:t xml:space="preserve"> your petition to the judge. The judge may issue an </w:t>
+            </w:r>
+            <w:r>
+              <w:rPr>
+                <w:rFonts w:cs="Arial"/>
+                <w:sz w:val="24"/>
+                <w:szCs w:val="24"/>
+              </w:rPr>
+              <w:t>order</w:t>
+            </w:r>
+            <w:r>
+              <w:rPr>
+                <w:rFonts w:cs="Arial"/>
+                <w:sz w:val="24"/>
+                <w:szCs w:val="24"/>
+              </w:rPr>
+              <w:t xml:space="preserve"> based on your petition.</w:t>
             </w:r>
           </w:p>
           <w:p>
@@ -2878,33 +2834,7 @@
                 <w:sz w:val="24"/>
                 <w:szCs w:val="24"/>
               </w:rPr>
-              <w:t>Go to court on the day listed on your notice.</w:t>
-            </w:r>
-          </w:p>
-          <w:p>
-            <w:pPr>
-              <w:pStyle w:val="NoSpacing"/>
-              <w:keepNext/>
-              <w:keepLines/>
-              <w:pageBreakBefore/>
-              <w:numPr>
-                <w:ilvl w:val="0"/>
-                <w:numId w:val="4"/>
-              </w:numPr>
-              <w:spacing w:after="40" w:line="360" w:lineRule="auto"/>
-              <w:rPr>
-                <w:rFonts w:cs="Arial"/>
-                <w:sz w:val="24"/>
-                <w:szCs w:val="24"/>
-              </w:rPr>
-            </w:pPr>
-            <w:r>
-              <w:rPr>
-                <w:rFonts w:cs="Arial"/>
-                <w:sz w:val="24"/>
-                <w:szCs w:val="24"/>
-              </w:rPr>
-              <w:t>You have the right to represent yourself in court. However, you are expected to follow the court's rules and procedures. Most people who work in the courthouse cannot give you legal advice; meaning they cannot help you decide what to do, evaluate your possibility of success, or present your argument to the judge.</w:t>
+              <w:t>The judge may grant the other party time to respond, and the court will then set a date for the hearing.</w:t>
             </w:r>
           </w:p>
           <w:p>
@@ -2927,25 +2857,55 @@
                 <w:sz w:val="24"/>
                 <w:szCs w:val="24"/>
               </w:rPr>
-              <w:t xml:space="preserve">Bring a copy of the documents you </w:t>
-            </w:r>
-            <w:proofErr w:type="gramStart"/>
-            <w:r>
-              <w:rPr>
-                <w:rFonts w:cs="Arial"/>
-                <w:sz w:val="24"/>
-                <w:szCs w:val="24"/>
-              </w:rPr>
-              <w:t>delivered</w:t>
-            </w:r>
-            <w:proofErr w:type="gramEnd"/>
-            <w:r>
-              <w:rPr>
-                <w:rFonts w:cs="Arial"/>
-                <w:sz w:val="24"/>
-                <w:szCs w:val="24"/>
-              </w:rPr>
-              <w:t xml:space="preserve"> to the hearing. Also bring the blank Order on Rule to Show Cause</w:t>
+              <w:t xml:space="preserve">Go to court on the day </w:t>
+            </w:r>
+            <w:r>
+              <w:rPr>
+                <w:rFonts w:cs="Arial"/>
+                <w:sz w:val="24"/>
+                <w:szCs w:val="24"/>
+              </w:rPr>
+              <w:t>of the hearing</w:t>
+            </w:r>
+            <w:r>
+              <w:rPr>
+                <w:rFonts w:cs="Arial"/>
+                <w:sz w:val="24"/>
+                <w:szCs w:val="24"/>
+              </w:rPr>
+              <w:t>.</w:t>
+            </w:r>
+            <w:r>
+              <w:rPr>
+                <w:rFonts w:cs="Arial"/>
+                <w:sz w:val="24"/>
+                <w:szCs w:val="24"/>
+              </w:rPr>
+              <w:t xml:space="preserve"> </w:t>
+            </w:r>
+            <w:r>
+              <w:rPr>
+                <w:rFonts w:cs="Arial"/>
+                <w:sz w:val="24"/>
+                <w:szCs w:val="24"/>
+              </w:rPr>
+              <w:t>Bring a copy of the documents you delivere</w:t>
+            </w:r>
+            <w:r>
+              <w:rPr>
+                <w:rFonts w:cs="Arial"/>
+                <w:sz w:val="24"/>
+                <w:szCs w:val="24"/>
+              </w:rPr>
+              <w:t>d</w:t>
+            </w:r>
+            <w:r>
+              <w:rPr>
+                <w:rFonts w:cs="Arial"/>
+                <w:sz w:val="24"/>
+                <w:szCs w:val="24"/>
+              </w:rPr>
+              <w:t>. Also bring the blank Order on Rule to Show Cause</w:t>
             </w:r>
             <w:r>
               <w:rPr>
@@ -2976,44 +2936,48 @@
                 <w:sz w:val="24"/>
                 <w:szCs w:val="24"/>
               </w:rPr>
-              <w:t xml:space="preserve">At this hearing, the judge might make a finding that </w:t>
-            </w:r>
-            <w:proofErr w:type="gramStart"/>
-            <w:r>
-              <w:rPr>
-                <w:rFonts w:cs="Arial"/>
-                <w:sz w:val="24"/>
-                <w:szCs w:val="24"/>
-              </w:rPr>
-              <w:t>other</w:t>
-            </w:r>
-            <w:proofErr w:type="gramEnd"/>
-            <w:r>
-              <w:rPr>
-                <w:rFonts w:cs="Arial"/>
-                <w:sz w:val="24"/>
-                <w:szCs w:val="24"/>
-              </w:rPr>
-              <w:t xml:space="preserve"> person is in contempt of court for not obeying the order or judgment. The judge can make this decision based on your Petition, your supporting documents, and what you say in </w:t>
-            </w:r>
-            <w:proofErr w:type="gramStart"/>
-            <w:r>
-              <w:rPr>
-                <w:rFonts w:cs="Arial"/>
-                <w:sz w:val="24"/>
-                <w:szCs w:val="24"/>
-              </w:rPr>
-              <w:t>court</w:t>
-            </w:r>
-            <w:r>
-              <w:rPr>
-                <w:rFonts w:cs="Arial"/>
-                <w:sz w:val="24"/>
-                <w:szCs w:val="24"/>
-              </w:rPr>
-              <w:t xml:space="preserve"> .</w:t>
-            </w:r>
-            <w:proofErr w:type="gramEnd"/>
+              <w:t>At th</w:t>
+            </w:r>
+            <w:r>
+              <w:rPr>
+                <w:rFonts w:cs="Arial"/>
+                <w:sz w:val="24"/>
+                <w:szCs w:val="24"/>
+              </w:rPr>
+              <w:t>e</w:t>
+            </w:r>
+            <w:r>
+              <w:rPr>
+                <w:rFonts w:cs="Arial"/>
+                <w:sz w:val="24"/>
+                <w:szCs w:val="24"/>
+              </w:rPr>
+              <w:t xml:space="preserve"> hearing, the judge might make a finding that other person is in contempt of court for not obeying the order or judgment. The judge can make this decision based on your Petition, your supporting documents, </w:t>
+            </w:r>
+            <w:r>
+              <w:rPr>
+                <w:rFonts w:cs="Arial"/>
+                <w:sz w:val="24"/>
+                <w:szCs w:val="24"/>
+              </w:rPr>
+              <w:t xml:space="preserve">who is at the hearing, </w:t>
+            </w:r>
+            <w:r>
+              <w:rPr>
+                <w:rFonts w:cs="Arial"/>
+                <w:sz w:val="24"/>
+                <w:szCs w:val="24"/>
+              </w:rPr>
+              <w:t>and what you say in court</w:t>
+            </w:r>
+            <w:r>
+              <w:rPr>
+                <w:rFonts w:cs="Arial"/>
+                <w:sz w:val="24"/>
+                <w:szCs w:val="24"/>
+              </w:rPr>
+              <w:t>.</w:t>
+            </w:r>
           </w:p>
           <w:p>
             <w:pPr>
@@ -3035,15 +2999,31 @@
                 <w:sz w:val="24"/>
                 <w:szCs w:val="24"/>
               </w:rPr>
-              <w:t>What happens depends on who is at the Petition hearin</w:t>
-            </w:r>
-            <w:r>
-              <w:rPr>
-                <w:rFonts w:cs="Arial"/>
-                <w:sz w:val="24"/>
-                <w:szCs w:val="24"/>
-              </w:rPr>
-              <w:t>g</w:t>
+              <w:t>T</w:t>
+            </w:r>
+            <w:r>
+              <w:rPr>
+                <w:rFonts w:cs="Arial"/>
+                <w:sz w:val="24"/>
+                <w:szCs w:val="24"/>
+              </w:rPr>
+              <w:t>he</w:t>
+            </w:r>
+            <w:r>
+              <w:rPr>
+                <w:rFonts w:cs="Arial"/>
+                <w:sz w:val="24"/>
+                <w:szCs w:val="24"/>
+              </w:rPr>
+              <w:t xml:space="preserve"> other party</w:t>
+            </w:r>
+            <w:r>
+              <w:rPr>
+                <w:rFonts w:cs="Arial"/>
+                <w:sz w:val="24"/>
+                <w:szCs w:val="24"/>
+              </w:rPr>
+              <w:t xml:space="preserve"> can either obey the order in court or make plans to. The judge will schedule another court date to see if they followed through with their plan. The judge might also schedule another court date if the person asks for time to get a lawyer</w:t>
             </w:r>
             <w:r>
               <w:rPr>
@@ -3074,33 +3054,42 @@
                 <w:sz w:val="24"/>
                 <w:szCs w:val="24"/>
               </w:rPr>
-              <w:t xml:space="preserve">If the other person is present, they can either obey the order in court or make plans to. The judge </w:t>
-            </w:r>
-            <w:proofErr w:type="gramStart"/>
-            <w:r>
-              <w:rPr>
-                <w:rFonts w:cs="Arial"/>
-                <w:sz w:val="24"/>
-                <w:szCs w:val="24"/>
-              </w:rPr>
-              <w:t>will</w:t>
-            </w:r>
-            <w:proofErr w:type="gramEnd"/>
-            <w:r>
-              <w:rPr>
-                <w:rFonts w:cs="Arial"/>
-                <w:sz w:val="24"/>
-                <w:szCs w:val="24"/>
-              </w:rPr>
-              <w:t xml:space="preserve"> schedule another court date to see if they followed through with their plan. The judge might also schedule another court date if the person asks for time to get a lawyer</w:t>
-            </w:r>
-            <w:r>
-              <w:rPr>
-                <w:rFonts w:cs="Arial"/>
-                <w:sz w:val="24"/>
-                <w:szCs w:val="24"/>
-              </w:rPr>
-              <w:t>.</w:t>
+              <w:t xml:space="preserve">If the judge believes that the other </w:t>
+            </w:r>
+            <w:r>
+              <w:rPr>
+                <w:rFonts w:cs="Arial"/>
+                <w:sz w:val="24"/>
+                <w:szCs w:val="24"/>
+              </w:rPr>
+              <w:t>p</w:t>
+            </w:r>
+            <w:r>
+              <w:t>arty</w:t>
+            </w:r>
+            <w:r>
+              <w:rPr>
+                <w:rFonts w:cs="Arial"/>
+                <w:sz w:val="24"/>
+                <w:szCs w:val="24"/>
+              </w:rPr>
+              <w:t xml:space="preserve"> disobeyed the order without a good reason, the judge could find them in contempt of court. If</w:t>
+            </w:r>
+            <w:r>
+              <w:rPr>
+                <w:rFonts w:cs="Arial"/>
+                <w:sz w:val="24"/>
+                <w:szCs w:val="24"/>
+              </w:rPr>
+              <w:t xml:space="preserve"> so, </w:t>
+            </w:r>
+            <w:r>
+              <w:rPr>
+                <w:rFonts w:cs="Arial"/>
+                <w:sz w:val="24"/>
+                <w:szCs w:val="24"/>
+              </w:rPr>
+              <w:t>the judge will decide on a punishment.</w:t>
             </w:r>
           </w:p>
           <w:p>
@@ -3123,45 +3112,47 @@
                 <w:sz w:val="24"/>
                 <w:szCs w:val="24"/>
               </w:rPr>
-              <w:t xml:space="preserve">If the judge believes that the other </w:t>
-            </w:r>
-            <w:r>
-              <w:rPr>
-                <w:rFonts w:cs="Arial"/>
-                <w:sz w:val="24"/>
-                <w:szCs w:val="24"/>
-              </w:rPr>
-              <w:t>p</w:t>
-            </w:r>
-            <w:r>
-              <w:t>arty</w:t>
-            </w:r>
-            <w:r>
-              <w:rPr>
-                <w:rFonts w:cs="Arial"/>
-                <w:sz w:val="24"/>
-                <w:szCs w:val="24"/>
-              </w:rPr>
-              <w:t xml:space="preserve"> disobeyed the order without a good reason, the judge could find them in contempt of court. If the judge finds the </w:t>
-            </w:r>
-            <w:r>
-              <w:rPr>
-                <w:rFonts w:cs="Arial"/>
-                <w:sz w:val="24"/>
-                <w:szCs w:val="24"/>
-              </w:rPr>
-              <w:t>o</w:t>
-            </w:r>
-            <w:r>
-              <w:t>ther party</w:t>
-            </w:r>
-            <w:r>
-              <w:rPr>
-                <w:rFonts w:cs="Arial"/>
-                <w:sz w:val="24"/>
-                <w:szCs w:val="24"/>
-              </w:rPr>
-              <w:t xml:space="preserve"> to be in contempt, the judge will decide on a punishment.</w:t>
+              <w:t xml:space="preserve">If the other person does not show up in court, the judge might order you to </w:t>
+            </w:r>
+            <w:r>
+              <w:rPr>
+                <w:rFonts w:cs="Arial"/>
+                <w:sz w:val="24"/>
+                <w:szCs w:val="24"/>
+              </w:rPr>
+              <w:t>re</w:t>
+            </w:r>
+            <w:r>
+              <w:rPr>
+                <w:rFonts w:cs="Arial"/>
+                <w:sz w:val="24"/>
+                <w:szCs w:val="24"/>
+              </w:rPr>
+              <w:t>deliver the Petition</w:t>
+            </w:r>
+            <w:r>
+              <w:rPr>
+                <w:rFonts w:cs="Arial"/>
+                <w:sz w:val="24"/>
+                <w:szCs w:val="24"/>
+              </w:rPr>
+              <w:t xml:space="preserve"> another way</w:t>
+            </w:r>
+            <w:r>
+              <w:rPr>
+                <w:rFonts w:cs="Arial"/>
+                <w:sz w:val="24"/>
+                <w:szCs w:val="24"/>
+              </w:rPr>
+              <w:t>. For example, you may have to ask the Sheriff to deliver the forms</w:t>
+            </w:r>
+            <w:r>
+              <w:rPr>
+                <w:rFonts w:cs="Arial"/>
+                <w:sz w:val="24"/>
+                <w:szCs w:val="24"/>
+              </w:rPr>
+              <w:t>.</w:t>
             </w:r>
           </w:p>
           <w:p>
@@ -3184,7 +3175,7 @@
                 <w:sz w:val="24"/>
                 <w:szCs w:val="24"/>
               </w:rPr>
-              <w:t>If the other person does not show up in court, the judge might order you to deliver the Petition to the other person another way. For example, you may have to ask the Sheriff to deliver (serve) the forms</w:t>
+              <w:t>If the judge thinks the other person knew about the court date but did not show up, the judge may issue a warrant, also called a body attachment, to bring the other person to court</w:t>
             </w:r>
             <w:r>
               <w:rPr>
@@ -3193,6 +3184,47 @@
                 <w:szCs w:val="24"/>
               </w:rPr>
               <w:t>.</w:t>
+            </w:r>
+          </w:p>
+          <w:p>
+            <w:pPr>
+              <w:pStyle w:val="NoSpacing"/>
+              <w:spacing w:line="360" w:lineRule="auto"/>
+              <w:rPr>
+                <w:rFonts w:cs="Arial"/>
+                <w:sz w:val="16"/>
+                <w:szCs w:val="16"/>
+              </w:rPr>
+            </w:pPr>
+          </w:p>
+          <w:p>
+            <w:pPr>
+              <w:pStyle w:val="NoSpacing"/>
+              <w:spacing w:after="40" w:line="360" w:lineRule="auto"/>
+              <w:rPr>
+                <w:rFonts w:cs="Arial"/>
+                <w:b/>
+                <w:sz w:val="24"/>
+                <w:szCs w:val="24"/>
+              </w:rPr>
+            </w:pPr>
+            <w:r>
+              <w:rPr>
+                <w:rFonts w:cs="Arial"/>
+                <w:b/>
+                <w:sz w:val="24"/>
+                <w:szCs w:val="24"/>
+              </w:rPr>
+              <w:t xml:space="preserve">6. </w:t>
+            </w:r>
+            <w:r>
+              <w:rPr>
+                <w:rFonts w:cs="Arial"/>
+                <w:b/>
+                <w:sz w:val="24"/>
+                <w:szCs w:val="24"/>
+              </w:rPr>
+              <w:t>Get a copy of the order</w:t>
             </w:r>
           </w:p>
           <w:p>
@@ -3215,57 +3247,41 @@
                 <w:sz w:val="24"/>
                 <w:szCs w:val="24"/>
               </w:rPr>
-              <w:t>If the judge thinks the other person knew about the court date but did not show up, the judge may issue a warrant, also called a body attachment, to bring the other person to court</w:t>
-            </w:r>
-            <w:r>
-              <w:rPr>
-                <w:rFonts w:cs="Arial"/>
-                <w:sz w:val="24"/>
-                <w:szCs w:val="24"/>
-              </w:rPr>
-              <w:t>.</w:t>
-            </w:r>
-          </w:p>
-          <w:p>
-            <w:pPr>
-              <w:pStyle w:val="NoSpacing"/>
-              <w:spacing w:line="360" w:lineRule="auto"/>
-              <w:ind w:left="360"/>
-              <w:rPr>
-                <w:rFonts w:cs="Arial"/>
-                <w:sz w:val="16"/>
-                <w:szCs w:val="16"/>
-              </w:rPr>
-            </w:pPr>
-          </w:p>
-          <w:p>
-            <w:pPr>
-              <w:pStyle w:val="NoSpacing"/>
-              <w:spacing w:after="40" w:line="360" w:lineRule="auto"/>
-              <w:rPr>
-                <w:rFonts w:cs="Arial"/>
-                <w:b/>
-                <w:sz w:val="24"/>
-                <w:szCs w:val="24"/>
-              </w:rPr>
-            </w:pPr>
-            <w:r>
-              <w:rPr>
-                <w:rFonts w:cs="Arial"/>
-                <w:b/>
-                <w:sz w:val="24"/>
-                <w:szCs w:val="24"/>
-              </w:rPr>
-              <w:t xml:space="preserve">6. </w:t>
-            </w:r>
-            <w:r>
-              <w:rPr>
-                <w:rFonts w:cs="Arial"/>
-                <w:b/>
-                <w:sz w:val="24"/>
-                <w:szCs w:val="24"/>
-              </w:rPr>
-              <w:t>Get a copy of the order</w:t>
+              <w:t xml:space="preserve">If the judge enters an </w:t>
+            </w:r>
+            <w:r>
+              <w:rPr>
+                <w:rFonts w:cs="Arial"/>
+                <w:i/>
+                <w:iCs/>
+                <w:sz w:val="24"/>
+                <w:szCs w:val="24"/>
+              </w:rPr>
+              <w:t xml:space="preserve">Order on Rule to Show Cause </w:t>
+            </w:r>
+            <w:r>
+              <w:rPr>
+                <w:rFonts w:cs="Arial"/>
+                <w:sz w:val="24"/>
+                <w:szCs w:val="24"/>
+              </w:rPr>
+              <w:t xml:space="preserve">, you should get a copy of the order for yourself and another copy to give to the other </w:t>
+            </w:r>
+            <w:r>
+              <w:rPr>
+                <w:rFonts w:cs="Arial"/>
+                <w:sz w:val="24"/>
+                <w:szCs w:val="24"/>
+              </w:rPr>
+              <w:t>party</w:t>
+            </w:r>
+            <w:r>
+              <w:rPr>
+                <w:rFonts w:cs="Arial"/>
+                <w:sz w:val="24"/>
+                <w:szCs w:val="24"/>
+              </w:rPr>
+              <w:t>.  </w:t>
             </w:r>
           </w:p>
           <w:p>
@@ -3277,9 +3293,10 @@
               </w:numPr>
               <w:spacing w:after="40" w:line="360" w:lineRule="auto"/>
               <w:rPr>
-                <w:rFonts w:cs="Arial"/>
-                <w:sz w:val="24"/>
-                <w:szCs w:val="24"/>
+                <w:rFonts w:eastAsiaTheme="majorEastAsia" w:cs="Arial"/>
+                <w:sz w:val="24"/>
+                <w:szCs w:val="24"/>
+                <w:u w:val="single"/>
               </w:rPr>
             </w:pPr>
             <w:r>
@@ -3288,85 +3305,6 @@
                 <w:sz w:val="24"/>
                 <w:szCs w:val="24"/>
               </w:rPr>
-              <w:t xml:space="preserve">If the judge enters an </w:t>
-            </w:r>
-            <w:r>
-              <w:rPr>
-                <w:rFonts w:cs="Arial"/>
-                <w:i/>
-                <w:iCs/>
-                <w:sz w:val="24"/>
-                <w:szCs w:val="24"/>
-              </w:rPr>
-              <w:t xml:space="preserve">Order on Rule to Show </w:t>
-            </w:r>
-            <w:proofErr w:type="gramStart"/>
-            <w:r>
-              <w:rPr>
-                <w:rFonts w:cs="Arial"/>
-                <w:i/>
-                <w:iCs/>
-                <w:sz w:val="24"/>
-                <w:szCs w:val="24"/>
-              </w:rPr>
-              <w:t xml:space="preserve">Cause </w:t>
-            </w:r>
-            <w:r>
-              <w:rPr>
-                <w:rFonts w:cs="Arial"/>
-                <w:sz w:val="24"/>
-                <w:szCs w:val="24"/>
-              </w:rPr>
-              <w:t>,</w:t>
-            </w:r>
-            <w:proofErr w:type="gramEnd"/>
-            <w:r>
-              <w:rPr>
-                <w:rFonts w:cs="Arial"/>
-                <w:sz w:val="24"/>
-                <w:szCs w:val="24"/>
-              </w:rPr>
-              <w:t xml:space="preserve"> you should get a copy of the order for yourself and another copy to give to the other </w:t>
-            </w:r>
-            <w:r>
-              <w:rPr>
-                <w:rFonts w:cs="Arial"/>
-                <w:sz w:val="24"/>
-                <w:szCs w:val="24"/>
-              </w:rPr>
-              <w:t>party</w:t>
-            </w:r>
-            <w:r>
-              <w:rPr>
-                <w:rFonts w:cs="Arial"/>
-                <w:sz w:val="24"/>
-                <w:szCs w:val="24"/>
-              </w:rPr>
-              <w:t>.  </w:t>
-            </w:r>
-          </w:p>
-          <w:p>
-            <w:pPr>
-              <w:pStyle w:val="NoSpacing"/>
-              <w:numPr>
-                <w:ilvl w:val="0"/>
-                <w:numId w:val="4"/>
-              </w:numPr>
-              <w:spacing w:after="40" w:line="360" w:lineRule="auto"/>
-              <w:rPr>
-                <w:rFonts w:eastAsiaTheme="majorEastAsia" w:cs="Arial"/>
-                <w:sz w:val="24"/>
-                <w:szCs w:val="24"/>
-                <w:u w:val="single"/>
-              </w:rPr>
-            </w:pPr>
-            <w:r>
-              <w:rPr>
-                <w:rFonts w:cs="Arial"/>
-                <w:sz w:val="24"/>
-                <w:szCs w:val="24"/>
-              </w:rPr>
-              <w:lastRenderedPageBreak/>
               <w:t>If the other side has a lawyer, and the lawyer prepares the order, make sure you read it before it is presented for the judge's signature. If you disagree with the order, try to work out the problem with the lawyer. If that does not work, tell the clerk you need to speak to the judge again.</w:t>
             </w:r>
           </w:p>
@@ -3377,7 +3315,7 @@
           <w:tcPr>
             <w:tcW w:w="10800" w:type="dxa"/>
             <w:tcBorders>
-              <w:top w:val="single" w:sz="4" w:space="0" w:color="auto"/>
+              <w:top w:val="nil"/>
               <w:left w:val="nil"/>
               <w:bottom w:val="nil"/>
               <w:right w:val="nil"/>
@@ -3400,15 +3338,13 @@
     </w:tbl>
     <w:p/>
     <w:sectPr>
-      <w:headerReference w:type="even" r:id="rId14"/>
-      <w:headerReference w:type="default" r:id="rId15"/>
-      <w:footerReference w:type="even" r:id="rId16"/>
-      <w:footerReference w:type="default" r:id="rId17"/>
-      <w:headerReference w:type="first" r:id="rId18"/>
-      <w:footerReference w:type="first" r:id="rId19"/>
+      <w:footerReference w:type="even" r:id="rId14"/>
+      <w:footerReference w:type="default" r:id="rId15"/>
+      <w:footerReference w:type="first" r:id="rId16"/>
       <w:pgSz w:w="12240" w:h="15840"/>
       <w:pgMar w:top="720" w:right="720" w:bottom="720" w:left="720" w:header="720" w:footer="720" w:gutter="0"/>
       <w:cols w:space="720"/>
+      <w:titlePg/>
       <w:docGrid w:linePitch="360"/>
     </w:sectPr>
   </w:body>
@@ -3439,7 +3375,65 @@
   <w:p>
     <w:pPr>
       <w:pStyle w:val="Footer"/>
+      <w:jc w:val="center"/>
+      <w:rPr>
+        <w:rFonts w:ascii="Arial" w:hAnsi="Arial" w:cs="Arial"/>
+        <w:b/>
+        <w:sz w:val="20"/>
+        <w:szCs w:val="20"/>
+      </w:rPr>
     </w:pPr>
+    <w:r>
+      <w:rPr>
+        <w:rFonts w:ascii="Arial" w:hAnsi="Arial" w:cs="Arial"/>
+        <w:b/>
+        <w:sz w:val="20"/>
+        <w:szCs w:val="20"/>
+      </w:rPr>
+      <w:t>THESE INSTRUCTIONS ARE FOR YOUR PERSONAL USE ONLY</w:t>
+    </w:r>
+    <w:r>
+      <w:rPr>
+        <w:rFonts w:ascii="Arial" w:hAnsi="Arial" w:cs="Arial"/>
+        <w:b/>
+        <w:sz w:val="20"/>
+        <w:szCs w:val="20"/>
+      </w:rPr>
+      <w:t>.</w:t>
+    </w:r>
+  </w:p>
+  <w:p>
+    <w:pPr>
+      <w:pStyle w:val="Footer"/>
+      <w:jc w:val="center"/>
+    </w:pPr>
+    <w:hyperlink r:id="rId1" w:history="1">
+      <w:r>
+        <w:rPr>
+          <w:rStyle w:val="Hyperlink"/>
+          <w:rFonts w:ascii="Arial" w:eastAsiaTheme="majorEastAsia" w:hAnsi="Arial" w:cs="Arial"/>
+          <w:b/>
+          <w:sz w:val="20"/>
+          <w:szCs w:val="20"/>
+        </w:rPr>
+        <w:t>www.illinoislegalaid.org</w:t>
+      </w:r>
+    </w:hyperlink>
+  </w:p>
+  <w:p>
+    <w:pPr>
+      <w:pStyle w:val="Footer"/>
+      <w:jc w:val="center"/>
+    </w:pPr>
+    <w:r>
+      <w:t xml:space="preserve">Page </w:t>
+    </w:r>
+    <w:r>
+      <w:t>2</w:t>
+    </w:r>
+    <w:r>
+      <w:t xml:space="preserve"> of 3</w:t>
+    </w:r>
   </w:p>
 </w:ftr>
 </file>
@@ -3494,6 +3488,15 @@
       </w:r>
     </w:hyperlink>
   </w:p>
+  <w:p>
+    <w:pPr>
+      <w:pStyle w:val="Footer"/>
+      <w:jc w:val="center"/>
+    </w:pPr>
+    <w:r>
+      <w:t>Page 3 of 3</w:t>
+    </w:r>
+  </w:p>
 </w:ftr>
 </file>
 
@@ -3502,7 +3505,65 @@
   <w:p>
     <w:pPr>
       <w:pStyle w:val="Footer"/>
+      <w:jc w:val="center"/>
+      <w:rPr>
+        <w:rFonts w:ascii="Arial" w:hAnsi="Arial" w:cs="Arial"/>
+        <w:b/>
+        <w:sz w:val="20"/>
+        <w:szCs w:val="20"/>
+      </w:rPr>
     </w:pPr>
+    <w:r>
+      <w:rPr>
+        <w:rFonts w:ascii="Arial" w:hAnsi="Arial" w:cs="Arial"/>
+        <w:b/>
+        <w:sz w:val="20"/>
+        <w:szCs w:val="20"/>
+      </w:rPr>
+      <w:t>THESE INSTRUCTIONS ARE FOR YOUR PERSONAL USE ONLY</w:t>
+    </w:r>
+    <w:r>
+      <w:rPr>
+        <w:rFonts w:ascii="Arial" w:hAnsi="Arial" w:cs="Arial"/>
+        <w:b/>
+        <w:sz w:val="20"/>
+        <w:szCs w:val="20"/>
+      </w:rPr>
+      <w:t>.</w:t>
+    </w:r>
+  </w:p>
+  <w:p>
+    <w:pPr>
+      <w:pStyle w:val="Footer"/>
+      <w:jc w:val="center"/>
+    </w:pPr>
+    <w:hyperlink r:id="rId1" w:history="1">
+      <w:r>
+        <w:rPr>
+          <w:rStyle w:val="Hyperlink"/>
+          <w:rFonts w:ascii="Arial" w:eastAsiaTheme="majorEastAsia" w:hAnsi="Arial" w:cs="Arial"/>
+          <w:b/>
+          <w:sz w:val="20"/>
+          <w:szCs w:val="20"/>
+        </w:rPr>
+        <w:t>www.illinoislegalaid.org</w:t>
+      </w:r>
+    </w:hyperlink>
+  </w:p>
+  <w:p>
+    <w:pPr>
+      <w:pStyle w:val="Footer"/>
+      <w:jc w:val="center"/>
+    </w:pPr>
+    <w:r>
+      <w:t xml:space="preserve">Page </w:t>
+    </w:r>
+    <w:r>
+      <w:t>1</w:t>
+    </w:r>
+    <w:r>
+      <w:t xml:space="preserve"> of 3</w:t>
+    </w:r>
   </w:p>
 </w:ftr>
 </file>
@@ -3524,36 +3585,6 @@
     </w:p>
   </w:footnote>
 </w:footnotes>
-</file>
-
-<file path=word/header1.xml><?xml version="1.0" encoding="utf-8"?>
-<w:hdr xmlns:wpc="http://schemas.microsoft.com/office/word/2010/wordprocessingCanvas" xmlns:cx="http://schemas.microsoft.com/office/drawing/2014/chartex" xmlns:cx1="http://schemas.microsoft.com/office/drawing/2015/9/8/chartex" xmlns:cx2="http://schemas.microsoft.com/office/drawing/2015/10/21/chartex" xmlns:cx3="http://schemas.microsoft.com/office/drawing/2016/5/9/chartex" xmlns:cx4="http://schemas.microsoft.com/office/drawing/2016/5/10/chartex" xmlns:cx5="http://schemas.microsoft.com/office/drawing/2016/5/11/chartex" xmlns:cx6="http://schemas.microsoft.com/office/drawing/2016/5/12/chartex" xmlns:cx7="http://schemas.microsoft.com/office/drawing/2016/5/13/chartex" xmlns:cx8="http://schemas.microsoft.com/office/drawing/2016/5/14/chartex" xmlns:mc="http://schemas.openxmlformats.org/markup-compatibility/2006" xmlns:aink="http://schemas.microsoft.com/office/drawing/2016/ink" xmlns:am3d="http://schemas.microsoft.com/office/drawing/2017/model3d" xmlns:o="urn:schemas-microsoft-com:office:office" xmlns:oel="http://schemas.microsoft.com/office/2019/extlst" xmlns:r="http://schemas.openxmlformats.org/officeDocument/2006/relationships" xmlns:m="http://schemas.openxmlformats.org/officeDocument/2006/math" xmlns:v="urn:schemas-microsoft-com:vml" xmlns:wp14="http://schemas.microsoft.com/office/word/2010/wordprocessingDrawing" xmlns:wp="http://schemas.openxmlformats.org/drawingml/2006/wordprocessingDrawing" xmlns:w10="urn:schemas-microsoft-com:office:word" xmlns:w="http://schemas.openxmlformats.org/wordprocessingml/2006/main" xmlns:w14="http://schemas.microsoft.com/office/word/2010/wordml" xmlns:w15="http://schemas.microsoft.com/office/word/2012/wordml" xmlns:w16cex="http://schemas.microsoft.com/office/word/2018/wordml/cex" xmlns:w16cid="http://schemas.microsoft.com/office/word/2016/wordml/cid" xmlns:w16="http://schemas.microsoft.com/office/word/2018/wordml" xmlns:w16du="http://schemas.microsoft.com/office/word/2023/wordml/word16du" xmlns:w16sdtdh="http://schemas.microsoft.com/office/word/2020/wordml/sdtdatahash" xmlns:w16sdtfl="http://schemas.microsoft.com/office/word/2024/wordml/sdtformatlock" xmlns:w16se="http://schemas.microsoft.com/office/word/2015/wordml/symex" xmlns:wpg="http://schemas.microsoft.com/office/word/2010/wordprocessingGroup" xmlns:wpi="http://schemas.microsoft.com/office/word/2010/wordprocessingInk" xmlns:wne="http://schemas.microsoft.com/office/word/2006/wordml" xmlns:wps="http://schemas.microsoft.com/office/word/2010/wordprocessingShape" mc:Ignorable="w14 w15 w16se w16cid w16 w16cex w16sdtdh w16sdtfl w16du wp14">
-  <w:p>
-    <w:pPr>
-      <w:pStyle w:val="Header"/>
-    </w:pPr>
-  </w:p>
-</w:hdr>
-</file>
-
-<file path=word/header2.xml><?xml version="1.0" encoding="utf-8"?>
-<w:hdr xmlns:wpc="http://schemas.microsoft.com/office/word/2010/wordprocessingCanvas" xmlns:cx="http://schemas.microsoft.com/office/drawing/2014/chartex" xmlns:cx1="http://schemas.microsoft.com/office/drawing/2015/9/8/chartex" xmlns:cx2="http://schemas.microsoft.com/office/drawing/2015/10/21/chartex" xmlns:cx3="http://schemas.microsoft.com/office/drawing/2016/5/9/chartex" xmlns:cx4="http://schemas.microsoft.com/office/drawing/2016/5/10/chartex" xmlns:cx5="http://schemas.microsoft.com/office/drawing/2016/5/11/chartex" xmlns:cx6="http://schemas.microsoft.com/office/drawing/2016/5/12/chartex" xmlns:cx7="http://schemas.microsoft.com/office/drawing/2016/5/13/chartex" xmlns:cx8="http://schemas.microsoft.com/office/drawing/2016/5/14/chartex" xmlns:mc="http://schemas.openxmlformats.org/markup-compatibility/2006" xmlns:aink="http://schemas.microsoft.com/office/drawing/2016/ink" xmlns:am3d="http://schemas.microsoft.com/office/drawing/2017/model3d" xmlns:o="urn:schemas-microsoft-com:office:office" xmlns:oel="http://schemas.microsoft.com/office/2019/extlst" xmlns:r="http://schemas.openxmlformats.org/officeDocument/2006/relationships" xmlns:m="http://schemas.openxmlformats.org/officeDocument/2006/math" xmlns:v="urn:schemas-microsoft-com:vml" xmlns:wp14="http://schemas.microsoft.com/office/word/2010/wordprocessingDrawing" xmlns:wp="http://schemas.openxmlformats.org/drawingml/2006/wordprocessingDrawing" xmlns:w10="urn:schemas-microsoft-com:office:word" xmlns:w="http://schemas.openxmlformats.org/wordprocessingml/2006/main" xmlns:w14="http://schemas.microsoft.com/office/word/2010/wordml" xmlns:w15="http://schemas.microsoft.com/office/word/2012/wordml" xmlns:w16cex="http://schemas.microsoft.com/office/word/2018/wordml/cex" xmlns:w16cid="http://schemas.microsoft.com/office/word/2016/wordml/cid" xmlns:w16="http://schemas.microsoft.com/office/word/2018/wordml" xmlns:w16du="http://schemas.microsoft.com/office/word/2023/wordml/word16du" xmlns:w16sdtdh="http://schemas.microsoft.com/office/word/2020/wordml/sdtdatahash" xmlns:w16sdtfl="http://schemas.microsoft.com/office/word/2024/wordml/sdtformatlock" xmlns:w16se="http://schemas.microsoft.com/office/word/2015/wordml/symex" xmlns:wpg="http://schemas.microsoft.com/office/word/2010/wordprocessingGroup" xmlns:wpi="http://schemas.microsoft.com/office/word/2010/wordprocessingInk" xmlns:wne="http://schemas.microsoft.com/office/word/2006/wordml" xmlns:wps="http://schemas.microsoft.com/office/word/2010/wordprocessingShape" mc:Ignorable="w14 w15 w16se w16cid w16 w16cex w16sdtdh w16sdtfl w16du wp14">
-  <w:p>
-    <w:pPr>
-      <w:pStyle w:val="Header"/>
-    </w:pPr>
-  </w:p>
-</w:hdr>
-</file>
-
-<file path=word/header3.xml><?xml version="1.0" encoding="utf-8"?>
-<w:hdr xmlns:wpc="http://schemas.microsoft.com/office/word/2010/wordprocessingCanvas" xmlns:cx="http://schemas.microsoft.com/office/drawing/2014/chartex" xmlns:cx1="http://schemas.microsoft.com/office/drawing/2015/9/8/chartex" xmlns:cx2="http://schemas.microsoft.com/office/drawing/2015/10/21/chartex" xmlns:cx3="http://schemas.microsoft.com/office/drawing/2016/5/9/chartex" xmlns:cx4="http://schemas.microsoft.com/office/drawing/2016/5/10/chartex" xmlns:cx5="http://schemas.microsoft.com/office/drawing/2016/5/11/chartex" xmlns:cx6="http://schemas.microsoft.com/office/drawing/2016/5/12/chartex" xmlns:cx7="http://schemas.microsoft.com/office/drawing/2016/5/13/chartex" xmlns:cx8="http://schemas.microsoft.com/office/drawing/2016/5/14/chartex" xmlns:mc="http://schemas.openxmlformats.org/markup-compatibility/2006" xmlns:aink="http://schemas.microsoft.com/office/drawing/2016/ink" xmlns:am3d="http://schemas.microsoft.com/office/drawing/2017/model3d" xmlns:o="urn:schemas-microsoft-com:office:office" xmlns:oel="http://schemas.microsoft.com/office/2019/extlst" xmlns:r="http://schemas.openxmlformats.org/officeDocument/2006/relationships" xmlns:m="http://schemas.openxmlformats.org/officeDocument/2006/math" xmlns:v="urn:schemas-microsoft-com:vml" xmlns:wp14="http://schemas.microsoft.com/office/word/2010/wordprocessingDrawing" xmlns:wp="http://schemas.openxmlformats.org/drawingml/2006/wordprocessingDrawing" xmlns:w10="urn:schemas-microsoft-com:office:word" xmlns:w="http://schemas.openxmlformats.org/wordprocessingml/2006/main" xmlns:w14="http://schemas.microsoft.com/office/word/2010/wordml" xmlns:w15="http://schemas.microsoft.com/office/word/2012/wordml" xmlns:w16cex="http://schemas.microsoft.com/office/word/2018/wordml/cex" xmlns:w16cid="http://schemas.microsoft.com/office/word/2016/wordml/cid" xmlns:w16="http://schemas.microsoft.com/office/word/2018/wordml" xmlns:w16du="http://schemas.microsoft.com/office/word/2023/wordml/word16du" xmlns:w16sdtdh="http://schemas.microsoft.com/office/word/2020/wordml/sdtdatahash" xmlns:w16sdtfl="http://schemas.microsoft.com/office/word/2024/wordml/sdtformatlock" xmlns:w16se="http://schemas.microsoft.com/office/word/2015/wordml/symex" xmlns:wpg="http://schemas.microsoft.com/office/word/2010/wordprocessingGroup" xmlns:wpi="http://schemas.microsoft.com/office/word/2010/wordprocessingInk" xmlns:wne="http://schemas.microsoft.com/office/word/2006/wordml" xmlns:wps="http://schemas.microsoft.com/office/word/2010/wordprocessingShape" mc:Ignorable="w14 w15 w16se w16cid w16 w16cex w16sdtdh w16sdtfl w16du wp14">
-  <w:p>
-    <w:pPr>
-      <w:pStyle w:val="Header"/>
-    </w:pPr>
-  </w:p>
-</w:hdr>
 </file>
 
 <file path=word/numbering.xml><?xml version="1.0" encoding="utf-8"?>

</xml_diff>

<commit_message>
Implemented May 11 2026 feedback
</commit_message>
<xml_diff>
--- a/docassemble/PetitionForRuleToShowCauseFamily/data/templates/instructions_petition_rule_cause_family.docx
+++ b/docassemble/PetitionForRuleToShowCauseFamily/data/templates/instructions_petition_rule_cause_family.docx
@@ -441,14 +441,14 @@
               <w:rPr>
                 <w:sz w:val="24"/>
               </w:rPr>
-              <w:t xml:space="preserve">Sign the Petition on pages 2 and </w:t>
+              <w:t>Sign the Petition</w:t>
             </w:r>
             <w:r>
               <w:rPr>
                 <w:spacing w:val="-5"/>
                 <w:sz w:val="24"/>
               </w:rPr>
-              <w:t>3.</w:t>
+              <w:t>.</w:t>
             </w:r>
           </w:p>
           <w:p>
@@ -1282,27 +1282,7 @@
                 <w:sz w:val="24"/>
                 <w:szCs w:val="24"/>
               </w:rPr>
-              <w:t xml:space="preserve">. The amount depends on the type of case you have and the county where you are filing. The e-filing system will calculate the fees depending on the type of case you have. If you do not pay the fees or include a fee waiver your e-filed document may be rejected. These fees may also include a credit card or </w:t>
-            </w:r>
-            <w:proofErr w:type="spellStart"/>
-            <w:r>
-              <w:rPr>
-                <w:rFonts w:cs="Arial"/>
-                <w:bCs/>
-                <w:sz w:val="24"/>
-                <w:szCs w:val="24"/>
-              </w:rPr>
-              <w:t>eCheck</w:t>
-            </w:r>
-            <w:proofErr w:type="spellEnd"/>
-            <w:r>
-              <w:rPr>
-                <w:rFonts w:cs="Arial"/>
-                <w:bCs/>
-                <w:sz w:val="24"/>
-                <w:szCs w:val="24"/>
-              </w:rPr>
-              <w:t xml:space="preserve"> processing fee.</w:t>
+              <w:t>. The amount depends on the type of case you have and the county where you are filing. The e-filing system will calculate the fees depending on the type of case you have. If you do not pay the fees or include a fee waiver your e-filed document may be rejected. These fees may also include a credit card or eCheck processing fee.</w:t>
             </w:r>
           </w:p>
           <w:p>
@@ -2764,7 +2744,49 @@
                 <w:sz w:val="24"/>
                 <w:szCs w:val="24"/>
               </w:rPr>
-              <w:t>You have the right to represent yourself in court. However, you are expected to follow the court's rules and procedures. Most people who work in the courthouse cannot give you legal advice; meaning they cannot help you decide what to do, evaluate your possibility of success, or present your argument to the judge.</w:t>
+              <w:t xml:space="preserve">You have the right to represent yourself in court. However, you are expected to follow the court's rules and procedures. Most people who work in the courthouse cannot give you legal advice; meaning they cannot </w:t>
+            </w:r>
+            <w:r>
+              <w:rPr>
+                <w:rFonts w:cs="Arial"/>
+                <w:sz w:val="24"/>
+                <w:szCs w:val="24"/>
+              </w:rPr>
+              <w:t>tell you</w:t>
+            </w:r>
+            <w:r>
+              <w:rPr>
+                <w:rFonts w:cs="Arial"/>
+                <w:sz w:val="24"/>
+                <w:szCs w:val="24"/>
+              </w:rPr>
+              <w:t xml:space="preserve"> what to do or present your argument to the judge.</w:t>
+            </w:r>
+          </w:p>
+          <w:p>
+            <w:pPr>
+              <w:pStyle w:val="NoSpacing"/>
+              <w:keepNext/>
+              <w:keepLines/>
+              <w:pageBreakBefore/>
+              <w:numPr>
+                <w:ilvl w:val="0"/>
+                <w:numId w:val="4"/>
+              </w:numPr>
+              <w:spacing w:after="40" w:line="360" w:lineRule="auto"/>
+              <w:rPr>
+                <w:rFonts w:cs="Arial"/>
+                <w:sz w:val="24"/>
+                <w:szCs w:val="24"/>
+              </w:rPr>
+            </w:pPr>
+            <w:r>
+              <w:rPr>
+                <w:rFonts w:cs="Arial"/>
+                <w:sz w:val="24"/>
+                <w:szCs w:val="24"/>
+              </w:rPr>
+              <w:t>There may be more than one court date. You should go to every court date and bring your documents to each one.</w:t>
             </w:r>
           </w:p>
           <w:p>
@@ -2795,7 +2817,23 @@
                 <w:sz w:val="24"/>
                 <w:szCs w:val="24"/>
               </w:rPr>
-              <w:t xml:space="preserve"> your petition to the judge. The judge may issue an </w:t>
+              <w:t xml:space="preserve"> your petition to the judge</w:t>
+            </w:r>
+            <w:r>
+              <w:rPr>
+                <w:rFonts w:cs="Arial"/>
+                <w:sz w:val="24"/>
+                <w:szCs w:val="24"/>
+              </w:rPr>
+              <w:t xml:space="preserve"> at the first court date</w:t>
+            </w:r>
+            <w:r>
+              <w:rPr>
+                <w:rFonts w:cs="Arial"/>
+                <w:sz w:val="24"/>
+                <w:szCs w:val="24"/>
+              </w:rPr>
+              <w:t xml:space="preserve">. The judge may issue an </w:t>
             </w:r>
             <w:r>
               <w:rPr>
@@ -2811,7 +2849,23 @@
                 <w:sz w:val="24"/>
                 <w:szCs w:val="24"/>
               </w:rPr>
-              <w:t xml:space="preserve"> based on your petition.</w:t>
+              <w:t xml:space="preserve"> based on your petition</w:t>
+            </w:r>
+            <w:r>
+              <w:rPr>
+                <w:rFonts w:cs="Arial"/>
+                <w:sz w:val="24"/>
+                <w:szCs w:val="24"/>
+              </w:rPr>
+              <w:t xml:space="preserve"> or they may schedule another court date</w:t>
+            </w:r>
+            <w:r>
+              <w:rPr>
+                <w:rFonts w:cs="Arial"/>
+                <w:sz w:val="24"/>
+                <w:szCs w:val="24"/>
+              </w:rPr>
+              <w:t>.</w:t>
             </w:r>
           </w:p>
           <w:p>
@@ -2834,7 +2888,15 @@
                 <w:sz w:val="24"/>
                 <w:szCs w:val="24"/>
               </w:rPr>
-              <w:t>The judge may grant the other party time to respond, and the court will then set a date for the hearing.</w:t>
+              <w:t>The judge may grant the other party time to respond</w:t>
+            </w:r>
+            <w:r>
+              <w:rPr>
+                <w:rFonts w:cs="Arial"/>
+                <w:sz w:val="24"/>
+                <w:szCs w:val="24"/>
+              </w:rPr>
+              <w:t xml:space="preserve"> or to start following the order.</w:t>
             </w:r>
           </w:p>
           <w:p>
@@ -2889,31 +2951,15 @@
                 <w:sz w:val="24"/>
                 <w:szCs w:val="24"/>
               </w:rPr>
-              <w:t>Bring a copy of the documents you delivere</w:t>
-            </w:r>
-            <w:r>
-              <w:rPr>
-                <w:rFonts w:cs="Arial"/>
-                <w:sz w:val="24"/>
-                <w:szCs w:val="24"/>
-              </w:rPr>
-              <w:t>d</w:t>
-            </w:r>
-            <w:r>
-              <w:rPr>
-                <w:rFonts w:cs="Arial"/>
-                <w:sz w:val="24"/>
-                <w:szCs w:val="24"/>
-              </w:rPr>
-              <w:t>. Also bring the blank Order on Rule to Show Cause</w:t>
-            </w:r>
-            <w:r>
-              <w:rPr>
-                <w:rFonts w:cs="Arial"/>
-                <w:sz w:val="24"/>
-                <w:szCs w:val="24"/>
-              </w:rPr>
-              <w:t>.</w:t>
+              <w:t xml:space="preserve">Bring a copy </w:t>
+            </w:r>
+            <w:r>
+              <w:rPr>
+                <w:rFonts w:cs="Arial"/>
+                <w:sz w:val="24"/>
+                <w:szCs w:val="24"/>
+              </w:rPr>
+              <w:t>of all your documents.</w:t>
             </w:r>
           </w:p>
           <w:p>
@@ -3390,7 +3436,7 @@
         <w:sz w:val="20"/>
         <w:szCs w:val="20"/>
       </w:rPr>
-      <w:t>THESE INSTRUCTIONS ARE FOR YOUR PERSONAL USE ONLY</w:t>
+      <w:t>THESE INSTRUCTIONS ARE FOR YOUR PERSONAL USE ONLY.</w:t>
     </w:r>
     <w:r>
       <w:rPr>
@@ -3399,14 +3445,8 @@
         <w:sz w:val="20"/>
         <w:szCs w:val="20"/>
       </w:rPr>
-      <w:t>.</w:t>
+      <w:t xml:space="preserve"> </w:t>
     </w:r>
-  </w:p>
-  <w:p>
-    <w:pPr>
-      <w:pStyle w:val="Footer"/>
-      <w:jc w:val="center"/>
-    </w:pPr>
     <w:hyperlink r:id="rId1" w:history="1">
       <w:r>
         <w:rPr>
@@ -3424,15 +3464,19 @@
     <w:pPr>
       <w:pStyle w:val="Footer"/>
       <w:jc w:val="center"/>
+      <w:rPr>
+        <w:rFonts w:ascii="Arial" w:hAnsi="Arial" w:cs="Arial"/>
+        <w:sz w:val="20"/>
+        <w:szCs w:val="20"/>
+      </w:rPr>
     </w:pPr>
     <w:r>
-      <w:t xml:space="preserve">Page </w:t>
-    </w:r>
-    <w:r>
-      <w:t>2</w:t>
-    </w:r>
-    <w:r>
-      <w:t xml:space="preserve"> of 3</w:t>
+      <w:rPr>
+        <w:rFonts w:ascii="Arial" w:hAnsi="Arial" w:cs="Arial"/>
+        <w:sz w:val="20"/>
+        <w:szCs w:val="20"/>
+      </w:rPr>
+      <w:t>Page 2 of 3</w:t>
     </w:r>
   </w:p>
 </w:ftr>
@@ -3458,7 +3502,7 @@
         <w:sz w:val="20"/>
         <w:szCs w:val="20"/>
       </w:rPr>
-      <w:t>THESE INSTRUCTIONS ARE FOR YOUR PERSONAL USE ONLY</w:t>
+      <w:t>THESE INSTRUCTIONS ARE FOR YOUR PERSONAL USE ONLY.</w:t>
     </w:r>
     <w:r>
       <w:rPr>
@@ -3467,14 +3511,8 @@
         <w:sz w:val="20"/>
         <w:szCs w:val="20"/>
       </w:rPr>
-      <w:t>.</w:t>
+      <w:t xml:space="preserve"> </w:t>
     </w:r>
-  </w:p>
-  <w:p>
-    <w:pPr>
-      <w:pStyle w:val="Footer"/>
-      <w:jc w:val="center"/>
-    </w:pPr>
     <w:hyperlink r:id="rId1" w:history="1">
       <w:r>
         <w:rPr>
@@ -3492,8 +3530,18 @@
     <w:pPr>
       <w:pStyle w:val="Footer"/>
       <w:jc w:val="center"/>
+      <w:rPr>
+        <w:rFonts w:ascii="Arial" w:hAnsi="Arial" w:cs="Arial"/>
+        <w:sz w:val="20"/>
+        <w:szCs w:val="20"/>
+      </w:rPr>
     </w:pPr>
     <w:r>
+      <w:rPr>
+        <w:rFonts w:ascii="Arial" w:hAnsi="Arial" w:cs="Arial"/>
+        <w:sz w:val="20"/>
+        <w:szCs w:val="20"/>
+      </w:rPr>
       <w:t>Page 3 of 3</w:t>
     </w:r>
   </w:p>
@@ -3520,7 +3568,7 @@
         <w:sz w:val="20"/>
         <w:szCs w:val="20"/>
       </w:rPr>
-      <w:t>THESE INSTRUCTIONS ARE FOR YOUR PERSONAL USE ONLY</w:t>
+      <w:t>THESE INSTRUCTIONS ARE FOR YOUR PERSONAL USE ONLY.</w:t>
     </w:r>
     <w:r>
       <w:rPr>
@@ -3529,14 +3577,8 @@
         <w:sz w:val="20"/>
         <w:szCs w:val="20"/>
       </w:rPr>
-      <w:t>.</w:t>
+      <w:t xml:space="preserve"> </w:t>
     </w:r>
-  </w:p>
-  <w:p>
-    <w:pPr>
-      <w:pStyle w:val="Footer"/>
-      <w:jc w:val="center"/>
-    </w:pPr>
     <w:hyperlink r:id="rId1" w:history="1">
       <w:r>
         <w:rPr>
@@ -3554,15 +3596,19 @@
     <w:pPr>
       <w:pStyle w:val="Footer"/>
       <w:jc w:val="center"/>
+      <w:rPr>
+        <w:rFonts w:ascii="Arial" w:hAnsi="Arial" w:cs="Arial"/>
+        <w:sz w:val="20"/>
+        <w:szCs w:val="20"/>
+      </w:rPr>
     </w:pPr>
     <w:r>
-      <w:t xml:space="preserve">Page </w:t>
-    </w:r>
-    <w:r>
-      <w:t>1</w:t>
-    </w:r>
-    <w:r>
-      <w:t xml:space="preserve"> of 3</w:t>
+      <w:rPr>
+        <w:rFonts w:ascii="Arial" w:hAnsi="Arial" w:cs="Arial"/>
+        <w:sz w:val="20"/>
+        <w:szCs w:val="20"/>
+      </w:rPr>
+      <w:t>Page 1 of 3</w:t>
     </w:r>
   </w:p>
 </w:ftr>

</xml_diff>

<commit_message>
confirming easy form has most recent instructions template
</commit_message>
<xml_diff>
--- a/docassemble/PetitionForRuleToShowCauseFamily/data/templates/instructions_petition_rule_cause_family.docx
+++ b/docassemble/PetitionForRuleToShowCauseFamily/data/templates/instructions_petition_rule_cause_family.docx
@@ -262,7 +262,25 @@
                 <w:sz w:val="24"/>
                 <w:szCs w:val="24"/>
               </w:rPr>
-              <w:t xml:space="preserve">Attach copies of any documents that will show the judge that the other person violated the court order. For example, a history of child support payments. If your child support payments are sent to you through the Illinois State Disbursement Unit (ILSDU), visit </w:t>
+              <w:t xml:space="preserve">Attach copies of any </w:t>
+            </w:r>
+            <w:proofErr w:type="gramStart"/>
+            <w:r>
+              <w:rPr>
+                <w:rFonts w:cs="Arial"/>
+                <w:sz w:val="24"/>
+                <w:szCs w:val="24"/>
+              </w:rPr>
+              <w:t>documents</w:t>
+            </w:r>
+            <w:proofErr w:type="gramEnd"/>
+            <w:r>
+              <w:rPr>
+                <w:rFonts w:cs="Arial"/>
+                <w:sz w:val="24"/>
+                <w:szCs w:val="24"/>
+              </w:rPr>
+              <w:t xml:space="preserve"> that will show the judge that the other person violated the court order. For example, a history of child support payments. If your child support payments are sent to you through the Illinois State Disbursement Unit (ILSDU), visit </w:t>
             </w:r>
             <w:hyperlink r:id="rId9">
               <w:r>
@@ -1231,7 +1249,25 @@
                 <w:sz w:val="24"/>
                 <w:szCs w:val="24"/>
               </w:rPr>
-              <w:t>give you a copy for your records.</w:t>
+              <w:t xml:space="preserve">give you a copy </w:t>
+            </w:r>
+            <w:proofErr w:type="gramStart"/>
+            <w:r>
+              <w:rPr>
+                <w:rFonts w:ascii="Arial" w:hAnsi="Arial" w:cs="Arial"/>
+                <w:sz w:val="24"/>
+                <w:szCs w:val="24"/>
+              </w:rPr>
+              <w:t>for</w:t>
+            </w:r>
+            <w:proofErr w:type="gramEnd"/>
+            <w:r>
+              <w:rPr>
+                <w:rFonts w:ascii="Arial" w:hAnsi="Arial" w:cs="Arial"/>
+                <w:sz w:val="24"/>
+                <w:szCs w:val="24"/>
+              </w:rPr>
+              <w:t xml:space="preserve"> your records.</w:t>
             </w:r>
             <w:r>
               <w:rPr>
@@ -1282,7 +1318,27 @@
                 <w:sz w:val="24"/>
                 <w:szCs w:val="24"/>
               </w:rPr>
-              <w:t>. The amount depends on the type of case you have and the county where you are filing. The e-filing system will calculate the fees depending on the type of case you have. If you do not pay the fees or include a fee waiver your e-filed document may be rejected. These fees may also include a credit card or eCheck processing fee.</w:t>
+              <w:t xml:space="preserve">. The amount depends on the type of case you have and the county where you are filing. The e-filing system will calculate the fees depending on the type of case you have. If you do not pay the fees or include a fee waiver your e-filed document may be rejected. These fees may also include a credit card or </w:t>
+            </w:r>
+            <w:proofErr w:type="spellStart"/>
+            <w:r>
+              <w:rPr>
+                <w:rFonts w:cs="Arial"/>
+                <w:bCs/>
+                <w:sz w:val="24"/>
+                <w:szCs w:val="24"/>
+              </w:rPr>
+              <w:t>eCheck</w:t>
+            </w:r>
+            <w:proofErr w:type="spellEnd"/>
+            <w:r>
+              <w:rPr>
+                <w:rFonts w:cs="Arial"/>
+                <w:bCs/>
+                <w:sz w:val="24"/>
+                <w:szCs w:val="24"/>
+              </w:rPr>
+              <w:t xml:space="preserve"> processing fee.</w:t>
             </w:r>
           </w:p>
           <w:p>
@@ -1385,7 +1441,25 @@
                 <w:sz w:val="24"/>
                 <w:szCs w:val="24"/>
               </w:rPr>
-              <w:t>You will need to schedule a hearing with the clerk. How you will find out about the hearing date and time depends on how you filed your case</w:t>
+              <w:t xml:space="preserve">You will need to schedule a hearing with the clerk. How you will find out about the hearing date and time depends on how you </w:t>
+            </w:r>
+            <w:proofErr w:type="gramStart"/>
+            <w:r>
+              <w:rPr>
+                <w:rFonts w:cs="Arial"/>
+                <w:sz w:val="24"/>
+                <w:szCs w:val="24"/>
+              </w:rPr>
+              <w:t>filed</w:t>
+            </w:r>
+            <w:proofErr w:type="gramEnd"/>
+            <w:r>
+              <w:rPr>
+                <w:rFonts w:cs="Arial"/>
+                <w:sz w:val="24"/>
+                <w:szCs w:val="24"/>
+              </w:rPr>
+              <w:t xml:space="preserve"> your case</w:t>
             </w:r>
             <w:r>
               <w:rPr>
@@ -1624,7 +1698,23 @@
                 <w:rFonts w:ascii="Arial" w:hAnsi="Arial" w:cs="Arial"/>
                 <w:sz w:val="24"/>
               </w:rPr>
-              <w:t xml:space="preserve"> To find the clerk for your county,  go to </w:t>
+              <w:t xml:space="preserve"> To find the clerk for your </w:t>
+            </w:r>
+            <w:proofErr w:type="gramStart"/>
+            <w:r>
+              <w:rPr>
+                <w:rFonts w:ascii="Arial" w:hAnsi="Arial" w:cs="Arial"/>
+                <w:sz w:val="24"/>
+              </w:rPr>
+              <w:t>county,  go</w:t>
+            </w:r>
+            <w:proofErr w:type="gramEnd"/>
+            <w:r>
+              <w:rPr>
+                <w:rFonts w:ascii="Arial" w:hAnsi="Arial" w:cs="Arial"/>
+                <w:sz w:val="24"/>
+              </w:rPr>
+              <w:t xml:space="preserve"> to </w:t>
             </w:r>
             <w:hyperlink r:id="rId13" w:history="1">
               <w:r>
@@ -1838,6 +1928,7 @@
               </w:rPr>
               <w:t xml:space="preserve"> </w:t>
             </w:r>
+            <w:proofErr w:type="gramStart"/>
             <w:r>
               <w:rPr>
                 <w:rFonts w:ascii="Arial" w:hAnsi="Arial" w:cs="Arial"/>
@@ -1845,6 +1936,7 @@
               </w:rPr>
               <w:t>will</w:t>
             </w:r>
+            <w:proofErr w:type="gramEnd"/>
             <w:r>
               <w:rPr>
                 <w:rFonts w:ascii="Arial" w:hAnsi="Arial" w:cs="Arial"/>
@@ -1903,7 +1995,23 @@
                 <w:rFonts w:ascii="Arial" w:hAnsi="Arial" w:cs="Arial"/>
                 <w:sz w:val="24"/>
               </w:rPr>
-              <w:t>or they may pick for you.</w:t>
+              <w:t xml:space="preserve">or they may </w:t>
+            </w:r>
+            <w:proofErr w:type="gramStart"/>
+            <w:r>
+              <w:rPr>
+                <w:rFonts w:ascii="Arial" w:hAnsi="Arial" w:cs="Arial"/>
+                <w:sz w:val="24"/>
+              </w:rPr>
+              <w:t>pick for you</w:t>
+            </w:r>
+            <w:proofErr w:type="gramEnd"/>
+            <w:r>
+              <w:rPr>
+                <w:rFonts w:ascii="Arial" w:hAnsi="Arial" w:cs="Arial"/>
+                <w:sz w:val="24"/>
+              </w:rPr>
+              <w:t>.</w:t>
             </w:r>
           </w:p>
           <w:p>
@@ -2961,6 +3069,14 @@
               </w:rPr>
               <w:t>of all your documents.</w:t>
             </w:r>
+            <w:r>
+              <w:rPr>
+                <w:rFonts w:cs="Arial"/>
+                <w:sz w:val="24"/>
+                <w:szCs w:val="24"/>
+              </w:rPr>
+              <w:t xml:space="preserve"> </w:t>
+            </w:r>
           </w:p>
           <w:p>
             <w:pPr>
@@ -2998,7 +3114,25 @@
                 <w:sz w:val="24"/>
                 <w:szCs w:val="24"/>
               </w:rPr>
-              <w:t xml:space="preserve"> hearing, the judge might make a finding that other person is in contempt of court for not obeying the order or judgment. The judge can make this decision based on your Petition, your supporting documents, </w:t>
+              <w:t xml:space="preserve"> hearing, the judge might make a finding that </w:t>
+            </w:r>
+            <w:proofErr w:type="gramStart"/>
+            <w:r>
+              <w:rPr>
+                <w:rFonts w:cs="Arial"/>
+                <w:sz w:val="24"/>
+                <w:szCs w:val="24"/>
+              </w:rPr>
+              <w:t>other</w:t>
+            </w:r>
+            <w:proofErr w:type="gramEnd"/>
+            <w:r>
+              <w:rPr>
+                <w:rFonts w:cs="Arial"/>
+                <w:sz w:val="24"/>
+                <w:szCs w:val="24"/>
+              </w:rPr>
+              <w:t xml:space="preserve"> person is in contempt of court for not obeying the order or judgment. The judge can make this decision based on your Petition, your supporting documents, </w:t>
             </w:r>
             <w:r>
               <w:rPr>
@@ -3069,7 +3203,43 @@
                 <w:sz w:val="24"/>
                 <w:szCs w:val="24"/>
               </w:rPr>
-              <w:t xml:space="preserve"> can either obey the order in court or make plans to. The judge will schedule another court date to see if they followed through with their plan. The judge might also schedule another court date if the person asks for time to get a lawyer</w:t>
+              <w:t xml:space="preserve"> can either obey the order in court or make plans </w:t>
+            </w:r>
+            <w:proofErr w:type="gramStart"/>
+            <w:r>
+              <w:rPr>
+                <w:rFonts w:cs="Arial"/>
+                <w:sz w:val="24"/>
+                <w:szCs w:val="24"/>
+              </w:rPr>
+              <w:t>to</w:t>
+            </w:r>
+            <w:proofErr w:type="gramEnd"/>
+            <w:r>
+              <w:rPr>
+                <w:rFonts w:cs="Arial"/>
+                <w:sz w:val="24"/>
+                <w:szCs w:val="24"/>
+              </w:rPr>
+              <w:t xml:space="preserve">. The judge </w:t>
+            </w:r>
+            <w:proofErr w:type="gramStart"/>
+            <w:r>
+              <w:rPr>
+                <w:rFonts w:cs="Arial"/>
+                <w:sz w:val="24"/>
+                <w:szCs w:val="24"/>
+              </w:rPr>
+              <w:t>will</w:t>
+            </w:r>
+            <w:proofErr w:type="gramEnd"/>
+            <w:r>
+              <w:rPr>
+                <w:rFonts w:cs="Arial"/>
+                <w:sz w:val="24"/>
+                <w:szCs w:val="24"/>
+              </w:rPr>
+              <w:t xml:space="preserve"> schedule another court date to see if they followed through with their plan. The judge might also schedule another court date if the person asks for time to get a lawyer</w:t>
             </w:r>
             <w:r>
               <w:rPr>
@@ -3303,15 +3473,35 @@
                 <w:sz w:val="24"/>
                 <w:szCs w:val="24"/>
               </w:rPr>
-              <w:t xml:space="preserve">Order on Rule to Show Cause </w:t>
-            </w:r>
-            <w:r>
-              <w:rPr>
-                <w:rFonts w:cs="Arial"/>
-                <w:sz w:val="24"/>
-                <w:szCs w:val="24"/>
-              </w:rPr>
-              <w:t xml:space="preserve">, you should get a copy of the order for yourself and another copy to give to the other </w:t>
+              <w:t xml:space="preserve">Order on Rule to Show </w:t>
+            </w:r>
+            <w:proofErr w:type="gramStart"/>
+            <w:r>
+              <w:rPr>
+                <w:rFonts w:cs="Arial"/>
+                <w:i/>
+                <w:iCs/>
+                <w:sz w:val="24"/>
+                <w:szCs w:val="24"/>
+              </w:rPr>
+              <w:t xml:space="preserve">Cause </w:t>
+            </w:r>
+            <w:r>
+              <w:rPr>
+                <w:rFonts w:cs="Arial"/>
+                <w:sz w:val="24"/>
+                <w:szCs w:val="24"/>
+              </w:rPr>
+              <w:t>,</w:t>
+            </w:r>
+            <w:proofErr w:type="gramEnd"/>
+            <w:r>
+              <w:rPr>
+                <w:rFonts w:cs="Arial"/>
+                <w:sz w:val="24"/>
+                <w:szCs w:val="24"/>
+              </w:rPr>
+              <w:t xml:space="preserve"> you should get a copy of the order for yourself and another copy to give to the other </w:t>
             </w:r>
             <w:r>
               <w:rPr>

</xml_diff>

<commit_message>
Implemented May 18 2026 feedback
</commit_message>
<xml_diff>
--- a/docassemble/PetitionForRuleToShowCauseFamily/data/templates/instructions_petition_rule_cause_family.docx
+++ b/docassemble/PetitionForRuleToShowCauseFamily/data/templates/instructions_petition_rule_cause_family.docx
@@ -262,25 +262,7 @@
                 <w:sz w:val="24"/>
                 <w:szCs w:val="24"/>
               </w:rPr>
-              <w:t xml:space="preserve">Attach copies of any </w:t>
-            </w:r>
-            <w:proofErr w:type="gramStart"/>
-            <w:r>
-              <w:rPr>
-                <w:rFonts w:cs="Arial"/>
-                <w:sz w:val="24"/>
-                <w:szCs w:val="24"/>
-              </w:rPr>
-              <w:t>documents</w:t>
-            </w:r>
-            <w:proofErr w:type="gramEnd"/>
-            <w:r>
-              <w:rPr>
-                <w:rFonts w:cs="Arial"/>
-                <w:sz w:val="24"/>
-                <w:szCs w:val="24"/>
-              </w:rPr>
-              <w:t xml:space="preserve"> that will show the judge that the other person violated the court order. For example, a history of child support payments. If your child support payments are sent to you through the Illinois State Disbursement Unit (ILSDU), visit </w:t>
+              <w:t xml:space="preserve">Attach copies of any documents that will show the judge that the other person violated the court order. For example, a history of child support payments. If your child support payments are sent to you through the Illinois State Disbursement Unit (ILSDU), visit </w:t>
             </w:r>
             <w:hyperlink r:id="rId9">
               <w:r>
@@ -1249,25 +1231,7 @@
                 <w:sz w:val="24"/>
                 <w:szCs w:val="24"/>
               </w:rPr>
-              <w:t xml:space="preserve">give you a copy </w:t>
-            </w:r>
-            <w:proofErr w:type="gramStart"/>
-            <w:r>
-              <w:rPr>
-                <w:rFonts w:ascii="Arial" w:hAnsi="Arial" w:cs="Arial"/>
-                <w:sz w:val="24"/>
-                <w:szCs w:val="24"/>
-              </w:rPr>
-              <w:t>for</w:t>
-            </w:r>
-            <w:proofErr w:type="gramEnd"/>
-            <w:r>
-              <w:rPr>
-                <w:rFonts w:ascii="Arial" w:hAnsi="Arial" w:cs="Arial"/>
-                <w:sz w:val="24"/>
-                <w:szCs w:val="24"/>
-              </w:rPr>
-              <w:t xml:space="preserve"> your records.</w:t>
+              <w:t>give you a copy for your records.</w:t>
             </w:r>
             <w:r>
               <w:rPr>
@@ -1281,6 +1245,7 @@
           <w:p>
             <w:pPr>
               <w:pStyle w:val="NoSpacing"/>
+              <w:keepNext/>
               <w:numPr>
                 <w:ilvl w:val="0"/>
                 <w:numId w:val="4"/>
@@ -1318,9 +1283,8 @@
                 <w:sz w:val="24"/>
                 <w:szCs w:val="24"/>
               </w:rPr>
-              <w:t xml:space="preserve">. The amount depends on the type of case you have and the county where you are filing. The e-filing system will calculate the fees depending on the type of case you have. If you do not pay the fees or include a fee waiver your e-filed document may be rejected. These fees may also include a credit card or </w:t>
-            </w:r>
-            <w:proofErr w:type="spellStart"/>
+              <w:t xml:space="preserve">. The amount depends on the type of case you have and the county where you are filing. The e-filing system will calculate the fees depending on the type </w:t>
+            </w:r>
             <w:r>
               <w:rPr>
                 <w:rFonts w:cs="Arial"/>
@@ -1328,22 +1292,27 @@
                 <w:sz w:val="24"/>
                 <w:szCs w:val="24"/>
               </w:rPr>
-              <w:t>eCheck</w:t>
-            </w:r>
-            <w:proofErr w:type="spellEnd"/>
-            <w:r>
-              <w:rPr>
-                <w:rFonts w:cs="Arial"/>
-                <w:bCs/>
-                <w:sz w:val="24"/>
-                <w:szCs w:val="24"/>
-              </w:rPr>
-              <w:t xml:space="preserve"> processing fee.</w:t>
+              <w:lastRenderedPageBreak/>
+              <w:t>of case you have. If you do not pay the fees or include a fee waiver your e-filed document may be rejected. These fees may also include a credit card or eCheck processing fee.</w:t>
             </w:r>
           </w:p>
           <w:p>
             <w:pPr>
               <w:pStyle w:val="NoSpacing"/>
+              <w:keepNext/>
+              <w:spacing w:line="360" w:lineRule="auto"/>
+              <w:rPr>
+                <w:rFonts w:cs="Arial"/>
+                <w:bCs/>
+                <w:sz w:val="24"/>
+                <w:szCs w:val="24"/>
+              </w:rPr>
+            </w:pPr>
+          </w:p>
+          <w:p>
+            <w:pPr>
+              <w:pStyle w:val="NoSpacing"/>
+              <w:keepNext/>
               <w:numPr>
                 <w:ilvl w:val="0"/>
                 <w:numId w:val="4"/>
@@ -1363,7 +1332,6 @@
                 <w:sz w:val="24"/>
                 <w:szCs w:val="24"/>
               </w:rPr>
-              <w:lastRenderedPageBreak/>
               <w:t xml:space="preserve">If you do not have money to pay court fees, use the Fee waiver program at </w:t>
             </w:r>
             <w:hyperlink r:id="rId12">
@@ -1441,25 +1409,7 @@
                 <w:sz w:val="24"/>
                 <w:szCs w:val="24"/>
               </w:rPr>
-              <w:t xml:space="preserve">You will need to schedule a hearing with the clerk. How you will find out about the hearing date and time depends on how you </w:t>
-            </w:r>
-            <w:proofErr w:type="gramStart"/>
-            <w:r>
-              <w:rPr>
-                <w:rFonts w:cs="Arial"/>
-                <w:sz w:val="24"/>
-                <w:szCs w:val="24"/>
-              </w:rPr>
-              <w:t>filed</w:t>
-            </w:r>
-            <w:proofErr w:type="gramEnd"/>
-            <w:r>
-              <w:rPr>
-                <w:rFonts w:cs="Arial"/>
-                <w:sz w:val="24"/>
-                <w:szCs w:val="24"/>
-              </w:rPr>
-              <w:t xml:space="preserve"> your case</w:t>
+              <w:t>You will need to schedule a hearing with the clerk. How you will find out about the hearing date and time depends on how you filed your case</w:t>
             </w:r>
             <w:r>
               <w:rPr>
@@ -1698,23 +1648,7 @@
                 <w:rFonts w:ascii="Arial" w:hAnsi="Arial" w:cs="Arial"/>
                 <w:sz w:val="24"/>
               </w:rPr>
-              <w:t xml:space="preserve"> To find the clerk for your </w:t>
-            </w:r>
-            <w:proofErr w:type="gramStart"/>
-            <w:r>
-              <w:rPr>
-                <w:rFonts w:ascii="Arial" w:hAnsi="Arial" w:cs="Arial"/>
-                <w:sz w:val="24"/>
-              </w:rPr>
-              <w:t>county,  go</w:t>
-            </w:r>
-            <w:proofErr w:type="gramEnd"/>
-            <w:r>
-              <w:rPr>
-                <w:rFonts w:ascii="Arial" w:hAnsi="Arial" w:cs="Arial"/>
-                <w:sz w:val="24"/>
-              </w:rPr>
-              <w:t xml:space="preserve"> to </w:t>
+              <w:t xml:space="preserve"> To find the clerk for your county,  go to </w:t>
             </w:r>
             <w:hyperlink r:id="rId13" w:history="1">
               <w:r>
@@ -1928,7 +1862,6 @@
               </w:rPr>
               <w:t xml:space="preserve"> </w:t>
             </w:r>
-            <w:proofErr w:type="gramStart"/>
             <w:r>
               <w:rPr>
                 <w:rFonts w:ascii="Arial" w:hAnsi="Arial" w:cs="Arial"/>
@@ -1936,7 +1869,6 @@
               </w:rPr>
               <w:t>will</w:t>
             </w:r>
-            <w:proofErr w:type="gramEnd"/>
             <w:r>
               <w:rPr>
                 <w:rFonts w:ascii="Arial" w:hAnsi="Arial" w:cs="Arial"/>
@@ -1995,23 +1927,7 @@
                 <w:rFonts w:ascii="Arial" w:hAnsi="Arial" w:cs="Arial"/>
                 <w:sz w:val="24"/>
               </w:rPr>
-              <w:t xml:space="preserve">or they may </w:t>
-            </w:r>
-            <w:proofErr w:type="gramStart"/>
-            <w:r>
-              <w:rPr>
-                <w:rFonts w:ascii="Arial" w:hAnsi="Arial" w:cs="Arial"/>
-                <w:sz w:val="24"/>
-              </w:rPr>
-              <w:t>pick for you</w:t>
-            </w:r>
-            <w:proofErr w:type="gramEnd"/>
-            <w:r>
-              <w:rPr>
-                <w:rFonts w:ascii="Arial" w:hAnsi="Arial" w:cs="Arial"/>
-                <w:sz w:val="24"/>
-              </w:rPr>
-              <w:t>.</w:t>
+              <w:t>or they may pick for you.</w:t>
             </w:r>
           </w:p>
           <w:p>
@@ -2447,7 +2363,14 @@
                 <w:rFonts w:ascii="Arial" w:hAnsi="Arial" w:cs="Arial"/>
                 <w:sz w:val="24"/>
               </w:rPr>
-              <w:t>(marked as Exhibit A);</w:t>
+              <w:t>(marked as Exhibit A)</w:t>
+            </w:r>
+            <w:r>
+              <w:rPr>
+                <w:rFonts w:ascii="Arial" w:hAnsi="Arial" w:cs="Arial"/>
+                <w:sz w:val="24"/>
+              </w:rPr>
+              <w:t>,</w:t>
             </w:r>
           </w:p>
           <w:p>
@@ -2656,7 +2579,14 @@
                 <w:rFonts w:ascii="Arial" w:hAnsi="Arial" w:cs="Arial"/>
                 <w:sz w:val="24"/>
               </w:rPr>
-              <w:t>the court order (marked as Exhibit B, Exhibit C, etc.);</w:t>
+              <w:t>the court order (marked as Exhibit B, Exhibit C, etc.)</w:t>
+            </w:r>
+            <w:r>
+              <w:rPr>
+                <w:rFonts w:ascii="Arial" w:hAnsi="Arial" w:cs="Arial"/>
+                <w:sz w:val="24"/>
+              </w:rPr>
+              <w:t>,</w:t>
             </w:r>
           </w:p>
           <w:p>
@@ -2684,7 +2614,21 @@
                 <w:rFonts w:ascii="Arial" w:hAnsi="Arial" w:cs="Arial"/>
                 <w:sz w:val="24"/>
               </w:rPr>
-              <w:t xml:space="preserve">Notice of Court Date for Hearing; </w:t>
+              <w:t>Notice of Court Date for Hearing</w:t>
+            </w:r>
+            <w:r>
+              <w:rPr>
+                <w:rFonts w:ascii="Arial" w:hAnsi="Arial" w:cs="Arial"/>
+                <w:sz w:val="24"/>
+              </w:rPr>
+              <w:t>,</w:t>
+            </w:r>
+            <w:r>
+              <w:rPr>
+                <w:rFonts w:ascii="Arial" w:hAnsi="Arial" w:cs="Arial"/>
+                <w:sz w:val="24"/>
+              </w:rPr>
+              <w:t xml:space="preserve"> </w:t>
             </w:r>
             <w:r>
               <w:rPr>
@@ -3059,6 +3003,14 @@
                 <w:sz w:val="24"/>
                 <w:szCs w:val="24"/>
               </w:rPr>
+              <w:t xml:space="preserve">Be ready to present your petition to the judge, even if you already did at an earlier court date. </w:t>
+            </w:r>
+            <w:r>
+              <w:rPr>
+                <w:rFonts w:cs="Arial"/>
+                <w:sz w:val="24"/>
+                <w:szCs w:val="24"/>
+              </w:rPr>
               <w:t xml:space="preserve">Bring a copy </w:t>
             </w:r>
             <w:r>
@@ -3114,25 +3066,7 @@
                 <w:sz w:val="24"/>
                 <w:szCs w:val="24"/>
               </w:rPr>
-              <w:t xml:space="preserve"> hearing, the judge might make a finding that </w:t>
-            </w:r>
-            <w:proofErr w:type="gramStart"/>
-            <w:r>
-              <w:rPr>
-                <w:rFonts w:cs="Arial"/>
-                <w:sz w:val="24"/>
-                <w:szCs w:val="24"/>
-              </w:rPr>
-              <w:t>other</w:t>
-            </w:r>
-            <w:proofErr w:type="gramEnd"/>
-            <w:r>
-              <w:rPr>
-                <w:rFonts w:cs="Arial"/>
-                <w:sz w:val="24"/>
-                <w:szCs w:val="24"/>
-              </w:rPr>
-              <w:t xml:space="preserve"> person is in contempt of court for not obeying the order or judgment. The judge can make this decision based on your Petition, your supporting documents, </w:t>
+              <w:t xml:space="preserve"> hearing, the judge might make a finding that other person is in contempt of court for not obeying the order or judgment. The judge can make this decision based on your Petition, your supporting documents, </w:t>
             </w:r>
             <w:r>
               <w:rPr>
@@ -3203,43 +3137,7 @@
                 <w:sz w:val="24"/>
                 <w:szCs w:val="24"/>
               </w:rPr>
-              <w:t xml:space="preserve"> can either obey the order in court or make plans </w:t>
-            </w:r>
-            <w:proofErr w:type="gramStart"/>
-            <w:r>
-              <w:rPr>
-                <w:rFonts w:cs="Arial"/>
-                <w:sz w:val="24"/>
-                <w:szCs w:val="24"/>
-              </w:rPr>
-              <w:t>to</w:t>
-            </w:r>
-            <w:proofErr w:type="gramEnd"/>
-            <w:r>
-              <w:rPr>
-                <w:rFonts w:cs="Arial"/>
-                <w:sz w:val="24"/>
-                <w:szCs w:val="24"/>
-              </w:rPr>
-              <w:t xml:space="preserve">. The judge </w:t>
-            </w:r>
-            <w:proofErr w:type="gramStart"/>
-            <w:r>
-              <w:rPr>
-                <w:rFonts w:cs="Arial"/>
-                <w:sz w:val="24"/>
-                <w:szCs w:val="24"/>
-              </w:rPr>
-              <w:t>will</w:t>
-            </w:r>
-            <w:proofErr w:type="gramEnd"/>
-            <w:r>
-              <w:rPr>
-                <w:rFonts w:cs="Arial"/>
-                <w:sz w:val="24"/>
-                <w:szCs w:val="24"/>
-              </w:rPr>
-              <w:t xml:space="preserve"> schedule another court date to see if they followed through with their plan. The judge might also schedule another court date if the person asks for time to get a lawyer</w:t>
+              <w:t xml:space="preserve"> can either obey the order in court or make plans to. The judge will schedule another court date to see if they followed through with their plan. The judge might also schedule another court date if the person asks for time to get a lawyer</w:t>
             </w:r>
             <w:r>
               <w:rPr>
@@ -3473,35 +3371,15 @@
                 <w:sz w:val="24"/>
                 <w:szCs w:val="24"/>
               </w:rPr>
-              <w:t xml:space="preserve">Order on Rule to Show </w:t>
-            </w:r>
-            <w:proofErr w:type="gramStart"/>
-            <w:r>
-              <w:rPr>
-                <w:rFonts w:cs="Arial"/>
-                <w:i/>
-                <w:iCs/>
-                <w:sz w:val="24"/>
-                <w:szCs w:val="24"/>
-              </w:rPr>
-              <w:t xml:space="preserve">Cause </w:t>
-            </w:r>
-            <w:r>
-              <w:rPr>
-                <w:rFonts w:cs="Arial"/>
-                <w:sz w:val="24"/>
-                <w:szCs w:val="24"/>
-              </w:rPr>
-              <w:t>,</w:t>
-            </w:r>
-            <w:proofErr w:type="gramEnd"/>
-            <w:r>
-              <w:rPr>
-                <w:rFonts w:cs="Arial"/>
-                <w:sz w:val="24"/>
-                <w:szCs w:val="24"/>
-              </w:rPr>
-              <w:t xml:space="preserve"> you should get a copy of the order for yourself and another copy to give to the other </w:t>
+              <w:t xml:space="preserve">Order on Rule to Show Cause </w:t>
+            </w:r>
+            <w:r>
+              <w:rPr>
+                <w:rFonts w:cs="Arial"/>
+                <w:sz w:val="24"/>
+                <w:szCs w:val="24"/>
+              </w:rPr>
+              <w:t xml:space="preserve">, you should get a copy of the order for yourself and another copy to give to the other </w:t>
             </w:r>
             <w:r>
               <w:rPr>

</xml_diff>

<commit_message>
Minor instructions template edits
</commit_message>
<xml_diff>
--- a/docassemble/PetitionForRuleToShowCauseFamily/data/templates/instructions_petition_rule_cause_family.docx
+++ b/docassemble/PetitionForRuleToShowCauseFamily/data/templates/instructions_petition_rule_cause_family.docx
@@ -1293,7 +1293,27 @@
                 <w:szCs w:val="24"/>
               </w:rPr>
               <w:lastRenderedPageBreak/>
-              <w:t>of case you have. If you do not pay the fees or include a fee waiver your e-filed document may be rejected. These fees may also include a credit card or eCheck processing fee.</w:t>
+              <w:t xml:space="preserve">of case you have. If you do not pay the fees or include a fee waiver your e-filed document may be rejected. These fees may also include a credit card or </w:t>
+            </w:r>
+            <w:proofErr w:type="spellStart"/>
+            <w:r>
+              <w:rPr>
+                <w:rFonts w:cs="Arial"/>
+                <w:bCs/>
+                <w:sz w:val="24"/>
+                <w:szCs w:val="24"/>
+              </w:rPr>
+              <w:t>eCheck</w:t>
+            </w:r>
+            <w:proofErr w:type="spellEnd"/>
+            <w:r>
+              <w:rPr>
+                <w:rFonts w:cs="Arial"/>
+                <w:bCs/>
+                <w:sz w:val="24"/>
+                <w:szCs w:val="24"/>
+              </w:rPr>
+              <w:t xml:space="preserve"> processing fee.</w:t>
             </w:r>
           </w:p>
           <w:p>
@@ -1648,7 +1668,7 @@
                 <w:rFonts w:ascii="Arial" w:hAnsi="Arial" w:cs="Arial"/>
                 <w:sz w:val="24"/>
               </w:rPr>
-              <w:t xml:space="preserve"> To find the clerk for your county,  go to </w:t>
+              <w:t xml:space="preserve"> To find the clerk for your county, go to </w:t>
             </w:r>
             <w:hyperlink r:id="rId13" w:history="1">
               <w:r>
@@ -3066,7 +3086,23 @@
                 <w:sz w:val="24"/>
                 <w:szCs w:val="24"/>
               </w:rPr>
-              <w:t xml:space="preserve"> hearing, the judge might make a finding that other person is in contempt of court for not obeying the order or judgment. The judge can make this decision based on your Petition, your supporting documents, </w:t>
+              <w:t xml:space="preserve"> hearing, the judge might make a finding that </w:t>
+            </w:r>
+            <w:r>
+              <w:rPr>
+                <w:rFonts w:cs="Arial"/>
+                <w:sz w:val="24"/>
+                <w:szCs w:val="24"/>
+              </w:rPr>
+              <w:t xml:space="preserve">the </w:t>
+            </w:r>
+            <w:r>
+              <w:rPr>
+                <w:rFonts w:cs="Arial"/>
+                <w:sz w:val="24"/>
+                <w:szCs w:val="24"/>
+              </w:rPr>
+              <w:t xml:space="preserve">other person is in contempt of court for not obeying the order or judgment. The judge can make this decision based on your Petition, your supporting documents, </w:t>
             </w:r>
             <w:r>
               <w:rPr>

</xml_diff>